<commit_message>
docs(bloc2): insert real diagrams into dossier-bloc2-v2 (architecture, MCD, sequence)
Co-Authored-By: Claude Sonnet 4.6 <noreply@anthropic.com>
</commit_message>
<xml_diff>
--- a/dossier-bloc2-v2.docx
+++ b/dossier-bloc2-v2.docx
@@ -853,7 +853,7 @@
           <w:sz w:val="20"/>
           <w:szCs w:val="20"/>
         </w:rPr>
-        <w:t xml:space="preserve">Ybuddy suit une architecture 3-tiers : le navigateur (React 18) communique avec l'API REST (NestJS) via HTTPS, qui persiste les données dans MariaDB conteneurisée sous Docker.</w:t>
+        <w:t xml:space="preserve">Ybuddy suit une architecture 3-tiers : le navigateur (React 18) communique avec l'API REST (NestJS) via HTTPS/Nginx, qui persiste les données dans MariaDB conteneurisée sous Docker. Le flux d'une requête passe par le Middleware, JwtAuthGuard, RolesGuard, ValidationPipe, puis le Controller et le Service avant d'atteindre la base de données.</w:t>
       </w:r>
     </w:p>
     <w:p>
@@ -863,618 +863,65 @@
     </w:p>
     <w:p>
       <w:pPr>
-        <w:spacing w:after="80" w:before="80"/>
+        <w:spacing w:after="60" w:before="80"/>
         <w:jc w:val="center"/>
       </w:pPr>
       <w:r>
-        <w:rPr>
-          <w:b/>
-          <w:bCs/>
-          <w:color w:val="1A2744"/>
-          <w:sz w:val="22"/>
-          <w:szCs w:val="22"/>
-        </w:rPr>
-        <w:t xml:space="preserve">Architecture 3-Tiers — Ybuddy</w:t>
-      </w:r>
-    </w:p>
-    <w:tbl>
-      <w:tblPr>
-        <w:tblW w:type="dxa" w:w="10080"/>
-        <w:tblBorders>
-          <w:top w:val="single" w:color="auto" w:sz="4"/>
-          <w:left w:val="single" w:color="auto" w:sz="4"/>
-          <w:bottom w:val="single" w:color="auto" w:sz="4"/>
-          <w:right w:val="single" w:color="auto" w:sz="4"/>
-          <w:insideH w:val="single" w:color="auto" w:sz="4"/>
-          <w:insideV w:val="single" w:color="auto" w:sz="4"/>
-        </w:tblBorders>
-      </w:tblPr>
-      <w:tblGrid>
-        <w:gridCol w:w="2500"/>
-        <w:gridCol w:w="400"/>
-        <w:gridCol w:w="4780"/>
-        <w:gridCol w:w="400"/>
-        <w:gridCol w:w="2000"/>
-      </w:tblGrid>
-      <w:tr>
-        <w:tc>
-          <w:tcPr>
-            <w:tcW w:type="dxa" w:w="2500"/>
-            <w:shd w:fill="E3F2FD" w:val="clear"/>
-            <w:vAlign w:val="center"/>
-          </w:tcPr>
-          <w:p>
-            <w:pPr>
-              <w:spacing w:after="40" w:before="40"/>
-              <w:jc w:val="left"/>
-            </w:pPr>
-            <w:r>
-              <w:rPr>
-                <w:b w:val="false"/>
-                <w:bCs w:val="false"/>
-                <w:color w:val="1565C0"/>
-                <w:sz w:val="18"/>
-                <w:szCs w:val="18"/>
-              </w:rPr>
-              <w:t xml:space="preserve">NAVIGATEUR</w:t>
-            </w:r>
-          </w:p>
-          <w:p>
-            <w:pPr>
-              <w:spacing w:after="40" w:before="40"/>
-              <w:jc w:val="left"/>
-            </w:pPr>
-            <w:r>
-              <w:rPr>
-                <w:b w:val="false"/>
-                <w:bCs w:val="false"/>
-                <w:color w:val="1565C0"/>
-                <w:sz w:val="18"/>
-                <w:szCs w:val="18"/>
-              </w:rPr>
-              <w:t xml:space="preserve"/>
-            </w:r>
-          </w:p>
-          <w:p>
-            <w:pPr>
-              <w:spacing w:after="40" w:before="40"/>
-              <w:jc w:val="left"/>
-            </w:pPr>
-            <w:r>
-              <w:rPr>
-                <w:b w:val="false"/>
-                <w:bCs w:val="false"/>
-                <w:color w:val="1565C0"/>
-                <w:sz w:val="18"/>
-                <w:szCs w:val="18"/>
-              </w:rPr>
-              <w:t xml:space="preserve">React 18 / Vite</w:t>
-            </w:r>
-          </w:p>
-          <w:p>
-            <w:pPr>
-              <w:spacing w:after="40" w:before="40"/>
-              <w:jc w:val="left"/>
-            </w:pPr>
-            <w:r>
-              <w:rPr>
-                <w:b w:val="false"/>
-                <w:bCs w:val="false"/>
-                <w:color w:val="1565C0"/>
-                <w:sz w:val="18"/>
-                <w:szCs w:val="18"/>
-              </w:rPr>
-              <w:t xml:space="preserve">Tailwind CSS</w:t>
-            </w:r>
-          </w:p>
-          <w:p>
-            <w:pPr>
-              <w:spacing w:after="40" w:before="40"/>
-              <w:jc w:val="left"/>
-            </w:pPr>
-            <w:r>
-              <w:rPr>
-                <w:b w:val="false"/>
-                <w:bCs w:val="false"/>
-                <w:color w:val="1565C0"/>
-                <w:sz w:val="18"/>
-                <w:szCs w:val="18"/>
-              </w:rPr>
-              <w:t xml:space="preserve">React Router</w:t>
-            </w:r>
-          </w:p>
-          <w:p>
-            <w:pPr>
-              <w:spacing w:after="40" w:before="40"/>
-              <w:jc w:val="left"/>
-            </w:pPr>
-            <w:r>
-              <w:rPr>
-                <w:b w:val="false"/>
-                <w:bCs w:val="false"/>
-                <w:color w:val="1565C0"/>
-                <w:sz w:val="18"/>
-                <w:szCs w:val="18"/>
-              </w:rPr>
-              <w:t xml:space="preserve">AuthContext (JWT)</w:t>
-            </w:r>
-          </w:p>
-          <w:p>
-            <w:pPr>
-              <w:spacing w:after="40" w:before="40"/>
-              <w:jc w:val="left"/>
-            </w:pPr>
-            <w:r>
-              <w:rPr>
-                <w:b w:val="false"/>
-                <w:bCs w:val="false"/>
-                <w:color w:val="1565C0"/>
-                <w:sz w:val="18"/>
-                <w:szCs w:val="18"/>
-              </w:rPr>
-              <w:t xml:space="preserve">PrivateRoute</w:t>
-            </w:r>
-          </w:p>
-        </w:tc>
-        <w:tc>
-          <w:tcPr>
-            <w:tcW w:type="dxa" w:w="400"/>
-            <w:vAlign w:val="center"/>
-          </w:tcPr>
-          <w:p>
-            <w:pPr>
-              <w:jc w:val="center"/>
-            </w:pPr>
-            <w:r>
-              <w:rPr>
-                <w:b/>
-                <w:bCs/>
-                <w:color w:val="9D7A3A"/>
-                <w:sz w:val="28"/>
-                <w:szCs w:val="28"/>
-              </w:rPr>
-              <w:t xml:space="preserve">⟷</w:t>
-            </w:r>
-          </w:p>
-        </w:tc>
-        <w:tc>
-          <w:tcPr>
-            <w:tcW w:type="dxa" w:w="4780"/>
-            <w:shd w:fill="FFF8E1" w:val="clear"/>
-            <w:vAlign w:val="center"/>
-          </w:tcPr>
-          <w:p>
-            <w:pPr>
-              <w:spacing w:after="60" w:before="60"/>
-              <w:jc w:val="center"/>
-            </w:pPr>
-            <w:r>
-              <w:rPr>
-                <w:b/>
-                <w:bCs/>
-                <w:color w:val="1A2744"/>
-                <w:sz w:val="20"/>
-                <w:szCs w:val="20"/>
-              </w:rPr>
-              <w:t xml:space="preserve">API REST — NestJS 10 / TypeScript</w:t>
-            </w:r>
-          </w:p>
-          <w:tbl>
-            <w:tblPr>
-              <w:tblW w:type="dxa" w:w="4600"/>
-              <w:tblBorders>
-                <w:top w:val="single" w:color="auto" w:sz="4"/>
-                <w:left w:val="single" w:color="auto" w:sz="4"/>
-                <w:bottom w:val="single" w:color="auto" w:sz="4"/>
-                <w:right w:val="single" w:color="auto" w:sz="4"/>
-                <w:insideH w:val="single" w:color="auto" w:sz="4"/>
-                <w:insideV w:val="single" w:color="auto" w:sz="4"/>
-              </w:tblBorders>
-            </w:tblPr>
-            <w:tblGrid>
-              <w:gridCol w:w="2300"/>
-              <w:gridCol w:w="2300"/>
-            </w:tblGrid>
-            <w:tr>
-              <w:tc>
-                <w:tcPr>
-                  <w:tcW w:type="dxa" w:w="2300"/>
-                  <w:shd w:fill="FFFDE7" w:val="clear"/>
-                  <w:vAlign w:val="center"/>
-                </w:tcPr>
-                <w:p>
-                  <w:pPr>
-                    <w:spacing w:after="60" w:before="60"/>
-                    <w:jc w:val="left"/>
-                  </w:pPr>
-                  <w:r>
-                    <w:rPr>
-                      <w:b w:val="false"/>
-                      <w:bCs w:val="false"/>
-                      <w:i w:val="false"/>
-                      <w:iCs w:val="false"/>
-                      <w:color w:val="1A2744"/>
-                      <w:sz w:val="16"/>
-                      <w:szCs w:val="16"/>
-                    </w:rPr>
-                    <w:t xml:space="preserve">AuthModule — JWT · bcrypt · RBAC</w:t>
-                  </w:r>
-                </w:p>
-              </w:tc>
-              <w:tc>
-                <w:tcPr>
-                  <w:tcW w:type="dxa" w:w="2300"/>
-                  <w:shd w:fill="FFFDE7" w:val="clear"/>
-                  <w:vAlign w:val="center"/>
-                </w:tcPr>
-                <w:p>
-                  <w:pPr>
-                    <w:spacing w:after="60" w:before="60"/>
-                    <w:jc w:val="left"/>
-                  </w:pPr>
-                  <w:r>
-                    <w:rPr>
-                      <w:b w:val="false"/>
-                      <w:bCs w:val="false"/>
-                      <w:i w:val="false"/>
-                      <w:iCs w:val="false"/>
-                      <w:color w:val="1A2744"/>
-                      <w:sz w:val="16"/>
-                      <w:szCs w:val="16"/>
-                    </w:rPr>
-                    <w:t xml:space="preserve">ProgramsModule — jours · exercices</w:t>
-                  </w:r>
-                </w:p>
-              </w:tc>
-            </w:tr>
-            <w:tr>
-              <w:tc>
-                <w:tcPr>
-                  <w:tcW w:type="dxa" w:w="2300"/>
-                  <w:shd w:fill="FFFDE7" w:val="clear"/>
-                  <w:vAlign w:val="center"/>
-                </w:tcPr>
-                <w:p>
-                  <w:pPr>
-                    <w:spacing w:after="60" w:before="60"/>
-                    <w:jc w:val="left"/>
-                  </w:pPr>
-                  <w:r>
-                    <w:rPr>
-                      <w:b w:val="false"/>
-                      <w:bCs w:val="false"/>
-                      <w:i w:val="false"/>
-                      <w:iCs w:val="false"/>
-                      <w:color w:val="1A2744"/>
-                      <w:sz w:val="16"/>
-                      <w:szCs w:val="16"/>
-                    </w:rPr>
-                    <w:t xml:space="preserve">CoachesModule — slug · clients</w:t>
-                  </w:r>
-                </w:p>
-              </w:tc>
-              <w:tc>
-                <w:tcPr>
-                  <w:tcW w:type="dxa" w:w="2300"/>
-                  <w:shd w:fill="FFFDE7" w:val="clear"/>
-                  <w:vAlign w:val="center"/>
-                </w:tcPr>
-                <w:p>
-                  <w:pPr>
-                    <w:spacing w:after="60" w:before="60"/>
-                    <w:jc w:val="left"/>
-                  </w:pPr>
-                  <w:r>
-                    <w:rPr>
-                      <w:b w:val="false"/>
-                      <w:bCs w:val="false"/>
-                      <w:i w:val="false"/>
-                      <w:iCs w:val="false"/>
-                      <w:color w:val="1A2744"/>
-                      <w:sz w:val="16"/>
-                      <w:szCs w:val="16"/>
-                    </w:rPr>
-                    <w:t xml:space="preserve">ExercisesModule — vidéos · seed</w:t>
-                  </w:r>
-                </w:p>
-              </w:tc>
-            </w:tr>
-            <w:tr>
-              <w:tc>
-                <w:tcPr>
-                  <w:tcW w:type="dxa" w:w="2300"/>
-                  <w:shd w:fill="FFFDE7" w:val="clear"/>
-                  <w:vAlign w:val="center"/>
-                </w:tcPr>
-                <w:p>
-                  <w:pPr>
-                    <w:spacing w:after="60" w:before="60"/>
-                    <w:jc w:val="left"/>
-                  </w:pPr>
-                  <w:r>
-                    <w:rPr>
-                      <w:b w:val="false"/>
-                      <w:bCs w:val="false"/>
-                      <w:i w:val="false"/>
-                      <w:iCs w:val="false"/>
-                      <w:color w:val="1A2744"/>
-                      <w:sz w:val="16"/>
-                      <w:szCs w:val="16"/>
-                    </w:rPr>
-                    <w:t xml:space="preserve">ClientsModule — profils</w:t>
-                  </w:r>
-                </w:p>
-              </w:tc>
-              <w:tc>
-                <w:tcPr>
-                  <w:tcW w:type="dxa" w:w="2300"/>
-                  <w:shd w:fill="FFFDE7" w:val="clear"/>
-                  <w:vAlign w:val="center"/>
-                </w:tcPr>
-                <w:p>
-                  <w:pPr>
-                    <w:spacing w:after="60" w:before="60"/>
-                    <w:jc w:val="left"/>
-                  </w:pPr>
-                  <w:r>
-                    <w:rPr>
-                      <w:b w:val="false"/>
-                      <w:bCs w:val="false"/>
-                      <w:i w:val="false"/>
-                      <w:iCs w:val="false"/>
-                      <w:color w:val="1A2744"/>
-                      <w:sz w:val="16"/>
-                      <w:szCs w:val="16"/>
-                    </w:rPr>
-                    <w:t xml:space="preserve">AdminModule — supervision</w:t>
-                  </w:r>
-                </w:p>
-              </w:tc>
-            </w:tr>
-            <w:tr>
-              <w:tc>
-                <w:tcPr>
-                  <w:tcW w:type="dxa" w:w="2300"/>
-                  <w:shd w:fill="FFFDE7" w:val="clear"/>
-                  <w:vAlign w:val="center"/>
-                </w:tcPr>
-                <w:p>
-                  <w:pPr>
-                    <w:spacing w:after="60" w:before="60"/>
-                    <w:jc w:val="left"/>
-                  </w:pPr>
-                  <w:r>
-                    <w:rPr>
-                      <w:b w:val="false"/>
-                      <w:bCs w:val="false"/>
-                      <w:i w:val="false"/>
-                      <w:iCs w:val="false"/>
-                      <w:color w:val="1A2744"/>
-                      <w:sz w:val="16"/>
-                      <w:szCs w:val="16"/>
-                    </w:rPr>
-                    <w:t xml:space="preserve">RequestsModule — demandes</w:t>
-                  </w:r>
-                </w:p>
-              </w:tc>
-              <w:tc>
-                <w:tcPr>
-                  <w:tcW w:type="dxa" w:w="2300"/>
-                  <w:shd w:fill="FFFDE7" w:val="clear"/>
-                  <w:vAlign w:val="center"/>
-                </w:tcPr>
-                <w:p>
-                  <w:pPr>
-                    <w:spacing w:after="60" w:before="60"/>
-                    <w:jc w:val="left"/>
-                  </w:pPr>
-                  <w:r>
-                    <w:rPr>
-                      <w:b w:val="false"/>
-                      <w:bCs w:val="false"/>
-                      <w:i w:val="false"/>
-                      <w:iCs w:val="false"/>
-                      <w:color w:val="1A2744"/>
-                      <w:sz w:val="16"/>
-                      <w:szCs w:val="16"/>
-                    </w:rPr>
-                    <w:t xml:space="preserve">UsersModule — rôles · profils</w:t>
-                  </w:r>
-                </w:p>
-              </w:tc>
-            </w:tr>
-          </w:tbl>
-          <w:p>
-            <w:pPr>
-              <w:spacing w:after="60" w:before="60"/>
-              <w:jc w:val="center"/>
-            </w:pPr>
-            <w:r>
-              <w:rPr>
-                <w:color w:val="777777"/>
-                <w:sz w:val="16"/>
-                <w:szCs w:val="16"/>
-              </w:rPr>
-              <w:t xml:space="preserve">TypeORM · Swagger · Helmet · Throttler · ValidationPipe</w:t>
-            </w:r>
-          </w:p>
-        </w:tc>
-        <w:tc>
-          <w:tcPr>
-            <w:tcW w:type="dxa" w:w="400"/>
-            <w:vAlign w:val="center"/>
-          </w:tcPr>
-          <w:p>
-            <w:pPr>
-              <w:jc w:val="center"/>
-            </w:pPr>
-            <w:r>
-              <w:rPr>
-                <w:b/>
-                <w:bCs/>
-                <w:color w:val="9D7A3A"/>
-                <w:sz w:val="28"/>
-                <w:szCs w:val="28"/>
-              </w:rPr>
-              <w:t xml:space="preserve">⟷</w:t>
-            </w:r>
-          </w:p>
-        </w:tc>
-        <w:tc>
-          <w:tcPr>
-            <w:tcW w:type="dxa" w:w="2000"/>
-            <w:shd w:fill="E8F5E9" w:val="clear"/>
-            <w:vAlign w:val="center"/>
-          </w:tcPr>
-          <w:p>
-            <w:pPr>
-              <w:spacing w:after="40" w:before="40"/>
-              <w:jc w:val="left"/>
-            </w:pPr>
-            <w:r>
-              <w:rPr>
-                <w:b w:val="false"/>
-                <w:bCs w:val="false"/>
-                <w:color w:val="2E7D32"/>
-                <w:sz w:val="18"/>
-                <w:szCs w:val="18"/>
-              </w:rPr>
-              <w:t xml:space="preserve">BASE DE DONNÉES</w:t>
-            </w:r>
-          </w:p>
-          <w:p>
-            <w:pPr>
-              <w:spacing w:after="40" w:before="40"/>
-              <w:jc w:val="left"/>
-            </w:pPr>
-            <w:r>
-              <w:rPr>
-                <w:b w:val="false"/>
-                <w:bCs w:val="false"/>
-                <w:color w:val="2E7D32"/>
-                <w:sz w:val="18"/>
-                <w:szCs w:val="18"/>
-              </w:rPr>
-              <w:t xml:space="preserve"/>
-            </w:r>
-          </w:p>
-          <w:p>
-            <w:pPr>
-              <w:spacing w:after="40" w:before="40"/>
-              <w:jc w:val="left"/>
-            </w:pPr>
-            <w:r>
-              <w:rPr>
-                <w:b w:val="false"/>
-                <w:bCs w:val="false"/>
-                <w:color w:val="2E7D32"/>
-                <w:sz w:val="18"/>
-                <w:szCs w:val="18"/>
-              </w:rPr>
-              <w:t xml:space="preserve">MariaDB 10.11</w:t>
-            </w:r>
-          </w:p>
-          <w:p>
-            <w:pPr>
-              <w:spacing w:after="40" w:before="40"/>
-              <w:jc w:val="left"/>
-            </w:pPr>
-            <w:r>
-              <w:rPr>
-                <w:b w:val="false"/>
-                <w:bCs w:val="false"/>
-                <w:color w:val="2E7D32"/>
-                <w:sz w:val="18"/>
-                <w:szCs w:val="18"/>
-              </w:rPr>
-              <w:t xml:space="preserve">Docker Compose</w:t>
-            </w:r>
-          </w:p>
-          <w:p>
-            <w:pPr>
-              <w:spacing w:after="40" w:before="40"/>
-              <w:jc w:val="left"/>
-            </w:pPr>
-            <w:r>
-              <w:rPr>
-                <w:b w:val="false"/>
-                <w:bCs w:val="false"/>
-                <w:color w:val="2E7D32"/>
-                <w:sz w:val="18"/>
-                <w:szCs w:val="18"/>
-              </w:rPr>
-              <w:t xml:space="preserve">Port 3307</w:t>
-            </w:r>
-          </w:p>
-          <w:p>
-            <w:pPr>
-              <w:spacing w:after="40" w:before="40"/>
-              <w:jc w:val="left"/>
-            </w:pPr>
-            <w:r>
-              <w:rPr>
-                <w:b w:val="false"/>
-                <w:bCs w:val="false"/>
-                <w:color w:val="2E7D32"/>
-                <w:sz w:val="18"/>
-                <w:szCs w:val="18"/>
-              </w:rPr>
-              <w:t xml:space="preserve"/>
-            </w:r>
-          </w:p>
-          <w:p>
-            <w:pPr>
-              <w:spacing w:after="40" w:before="40"/>
-              <w:jc w:val="left"/>
-            </w:pPr>
-            <w:r>
-              <w:rPr>
-                <w:b w:val="false"/>
-                <w:bCs w:val="false"/>
-                <w:color w:val="2E7D32"/>
-                <w:sz w:val="18"/>
-                <w:szCs w:val="18"/>
-              </w:rPr>
-              <w:t xml:space="preserve">GitHub Actions</w:t>
-            </w:r>
-          </w:p>
-          <w:p>
-            <w:pPr>
-              <w:spacing w:after="40" w:before="40"/>
-              <w:jc w:val="left"/>
-            </w:pPr>
-            <w:r>
-              <w:rPr>
-                <w:b w:val="false"/>
-                <w:bCs w:val="false"/>
-                <w:color w:val="2E7D32"/>
-                <w:sz w:val="18"/>
-                <w:szCs w:val="18"/>
-              </w:rPr>
-              <w:t xml:space="preserve">CI/CD Pipeline</w:t>
-            </w:r>
-          </w:p>
-        </w:tc>
-      </w:tr>
-    </w:tbl>
-    <w:p>
-      <w:pPr>
-        <w:spacing w:after="120" w:before="60"/>
-        <w:jc w:val="center"/>
-      </w:pPr>
-      <w:r>
-        <w:rPr>
-          <w:color w:val="888888"/>
-          <w:sz w:val="16"/>
-          <w:szCs w:val="16"/>
-        </w:rPr>
-        <w:t xml:space="preserve">HTTPS / REST+JSON</w:t>
+        <w:drawing>
+          <wp:inline distT="0" distB="0" distL="0" distR="0">
+            <wp:extent cx="5715000" cy="4953000"/>
+            <wp:effectExtent t="0" r="0" b="0" l="0"/>
+            <wp:docPr id="1" name="" descr="" title=""/>
+            <wp:cNvGraphicFramePr>
+              <a:graphicFrameLocks xmlns:a="http://schemas.openxmlformats.org/drawingml/2006/main" noChangeAspect="1"/>
+            </wp:cNvGraphicFramePr>
+            <a:graphic xmlns:a="http://schemas.openxmlformats.org/drawingml/2006/main">
+              <a:graphicData uri="http://schemas.openxmlformats.org/drawingml/2006/picture">
+                <pic:pic xmlns:pic="http://schemas.openxmlformats.org/drawingml/2006/picture">
+                  <pic:nvPicPr>
+                    <pic:cNvPr id="0" name="" descr=""/>
+                    <pic:cNvPicPr>
+                      <a:picLocks noChangeAspect="1" noChangeArrowheads="1"/>
+                    </pic:cNvPicPr>
+                  </pic:nvPicPr>
+                  <pic:blipFill>
+                    <a:blip r:embed="rId7" cstate="none"/>
+                    <a:srcRect/>
+                    <a:stretch>
+                      <a:fillRect/>
+                    </a:stretch>
+                  </pic:blipFill>
+                  <pic:spPr bwMode="auto">
+                    <a:xfrm>
+                      <a:off x="0" y="0"/>
+                      <a:ext cx="5715000" cy="4953000"/>
+                    </a:xfrm>
+                    <a:prstGeom prst="rect">
+                      <a:avLst/>
+                    </a:prstGeom>
+                  </pic:spPr>
+                </pic:pic>
+              </a:graphicData>
+            </a:graphic>
+          </wp:inline>
+        </w:drawing>
       </w:r>
     </w:p>
     <w:p>
       <w:pPr>
         <w:spacing w:after="120"/>
+        <w:jc w:val="center"/>
       </w:pPr>
+      <w:r>
+        <w:rPr>
+          <w:i/>
+          <w:iCs/>
+          <w:color w:val="666666"/>
+          <w:sz w:val="18"/>
+          <w:szCs w:val="18"/>
+        </w:rPr>
+        <w:t xml:space="preserve">Figure 1 — Architecture globale Ybuddy (3-tiers + flux de requête)</w:t>
+      </w:r>
     </w:p>
     <w:p>
       <w:pPr>
@@ -2784,1001 +2231,70 @@
         <w:spacing w:after="110" w:before="220"/>
       </w:pPr>
       <w:r>
-        <w:t xml:space="preserve">1.5 Modèle Conceptuel de Données</w:t>
+        <w:t xml:space="preserve">1.5 Modèle Conceptuel de Données (MCD)</w:t>
       </w:r>
     </w:p>
     <w:p>
       <w:pPr>
-        <w:spacing w:after="80" w:before="80"/>
+        <w:spacing w:after="60" w:before="80"/>
+        <w:jc w:val="center"/>
+      </w:pPr>
+      <w:r>
+        <w:drawing>
+          <wp:inline distT="0" distB="0" distL="0" distR="0">
+            <wp:extent cx="4381500" cy="5143500"/>
+            <wp:effectExtent t="0" r="0" b="0" l="0"/>
+            <wp:docPr id="1" name="" descr="" title=""/>
+            <wp:cNvGraphicFramePr>
+              <a:graphicFrameLocks xmlns:a="http://schemas.openxmlformats.org/drawingml/2006/main" noChangeAspect="1"/>
+            </wp:cNvGraphicFramePr>
+            <a:graphic xmlns:a="http://schemas.openxmlformats.org/drawingml/2006/main">
+              <a:graphicData uri="http://schemas.openxmlformats.org/drawingml/2006/picture">
+                <pic:pic xmlns:pic="http://schemas.openxmlformats.org/drawingml/2006/picture">
+                  <pic:nvPicPr>
+                    <pic:cNvPr id="0" name="" descr=""/>
+                    <pic:cNvPicPr>
+                      <a:picLocks noChangeAspect="1" noChangeArrowheads="1"/>
+                    </pic:cNvPicPr>
+                  </pic:nvPicPr>
+                  <pic:blipFill>
+                    <a:blip r:embed="rId8" cstate="none"/>
+                    <a:srcRect/>
+                    <a:stretch>
+                      <a:fillRect/>
+                    </a:stretch>
+                  </pic:blipFill>
+                  <pic:spPr bwMode="auto">
+                    <a:xfrm>
+                      <a:off x="0" y="0"/>
+                      <a:ext cx="4381500" cy="5143500"/>
+                    </a:xfrm>
+                    <a:prstGeom prst="rect">
+                      <a:avLst/>
+                    </a:prstGeom>
+                  </pic:spPr>
+                </pic:pic>
+              </a:graphicData>
+            </a:graphic>
+          </wp:inline>
+        </w:drawing>
+      </w:r>
+    </w:p>
+    <w:p>
+      <w:pPr>
+        <w:spacing w:after="120"/>
         <w:jc w:val="center"/>
       </w:pPr>
       <w:r>
         <w:rPr>
-          <w:b/>
-          <w:bCs/>
-          <w:color w:val="1A2744"/>
-          <w:sz w:val="22"/>
-          <w:szCs w:val="22"/>
-        </w:rPr>
-        <w:t xml:space="preserve">Modèle Conceptuel de Données (MCD)</w:t>
-      </w:r>
-    </w:p>
-    <w:tbl>
-      <w:tblPr>
-        <w:tblW w:type="dxa" w:w="10080"/>
-        <w:tblBorders>
-          <w:top w:val="single" w:color="auto" w:sz="4"/>
-          <w:left w:val="single" w:color="auto" w:sz="4"/>
-          <w:bottom w:val="single" w:color="auto" w:sz="4"/>
-          <w:right w:val="single" w:color="auto" w:sz="4"/>
-          <w:insideH w:val="single" w:color="auto" w:sz="4"/>
-          <w:insideV w:val="single" w:color="auto" w:sz="4"/>
-        </w:tblBorders>
-      </w:tblPr>
-      <w:tblGrid>
-        <w:gridCol w:w="2400"/>
-        <w:gridCol w:w="480"/>
-        <w:gridCol w:w="2400"/>
-        <w:gridCol w:w="480"/>
-        <w:gridCol w:w="2400"/>
-        <w:gridCol w:w="480"/>
-        <w:gridCol w:w="2400"/>
-      </w:tblGrid>
-      <w:tr>
-        <w:tc>
-          <w:tcPr>
-            <w:tcW w:type="dxa" w:w="2400"/>
-            <w:shd w:fill="F5F5F5" w:val="clear"/>
-            <w:vAlign w:val="top"/>
-          </w:tcPr>
-          <w:p>
-            <w:pPr>
-              <w:shd w:fill="1A2744" w:val="clear"/>
-              <w:spacing w:after="60" w:before="60"/>
-              <w:jc w:val="center"/>
-            </w:pPr>
-            <w:r>
-              <w:rPr>
-                <w:b/>
-                <w:bCs/>
-                <w:color w:val="FFFFFF"/>
-                <w:sz w:val="18"/>
-                <w:szCs w:val="18"/>
-                <w:highlight w:val="darkBlue"/>
-                <w:highlightCs w:val="darkBlue"/>
-              </w:rPr>
-              <w:t xml:space="preserve">User</w:t>
-            </w:r>
-          </w:p>
-          <w:p>
-            <w:pPr>
-              <w:spacing w:after="30" w:before="30"/>
-              <w:ind w:left="80"/>
-            </w:pPr>
-            <w:r>
-              <w:rPr>
-                <w:color w:val="9D7A3A"/>
-                <w:sz w:val="16"/>
-                <w:szCs w:val="16"/>
-              </w:rPr>
-              <w:t xml:space="preserve">🔑 id</w:t>
-            </w:r>
-          </w:p>
-          <w:p>
-            <w:pPr>
-              <w:spacing w:after="30" w:before="30"/>
-              <w:ind w:left="80"/>
-            </w:pPr>
-            <w:r>
-              <w:rPr>
-                <w:color w:val="333333"/>
-                <w:sz w:val="16"/>
-                <w:szCs w:val="16"/>
-              </w:rPr>
-              <w:t xml:space="preserve">name</w:t>
-            </w:r>
-          </w:p>
-          <w:p>
-            <w:pPr>
-              <w:spacing w:after="30" w:before="30"/>
-              <w:ind w:left="80"/>
-            </w:pPr>
-            <w:r>
-              <w:rPr>
-                <w:color w:val="333333"/>
-                <w:sz w:val="16"/>
-                <w:szCs w:val="16"/>
-              </w:rPr>
-              <w:t xml:space="preserve">email (unique)</w:t>
-            </w:r>
-          </w:p>
-          <w:p>
-            <w:pPr>
-              <w:spacing w:after="30" w:before="30"/>
-              <w:ind w:left="80"/>
-            </w:pPr>
-            <w:r>
-              <w:rPr>
-                <w:color w:val="333333"/>
-                <w:sz w:val="16"/>
-                <w:szCs w:val="16"/>
-              </w:rPr>
-              <w:t xml:space="preserve">password (bcrypt)</w:t>
-            </w:r>
-          </w:p>
-          <w:p>
-            <w:pPr>
-              <w:spacing w:after="30" w:before="30"/>
-              <w:ind w:left="80"/>
-            </w:pPr>
-            <w:r>
-              <w:rPr>
-                <w:color w:val="333333"/>
-                <w:sz w:val="16"/>
-                <w:szCs w:val="16"/>
-              </w:rPr>
-              <w:t xml:space="preserve">role (ADMIN/COACH/CLIENT)</w:t>
-            </w:r>
-          </w:p>
-          <w:p>
-            <w:pPr>
-              <w:spacing w:after="30" w:before="30"/>
-              <w:ind w:left="80"/>
-            </w:pPr>
-            <w:r>
-              <w:rPr>
-                <w:color w:val="333333"/>
-                <w:sz w:val="16"/>
-                <w:szCs w:val="16"/>
-              </w:rPr>
-              <w:t xml:space="preserve">slug</w:t>
-            </w:r>
-          </w:p>
-        </w:tc>
-        <w:tc>
-          <w:tcPr>
-            <w:tcW w:type="dxa" w:w="480"/>
-            <w:vAlign w:val="center"/>
-          </w:tcPr>
-          <w:p>
-            <w:pPr>
-              <w:jc w:val="center"/>
-            </w:pPr>
-            <w:r>
-              <w:rPr>
-                <w:b/>
-                <w:bCs/>
-                <w:color w:val="9D7A3A"/>
-                <w:sz w:val="18"/>
-                <w:szCs w:val="18"/>
-              </w:rPr>
-              <w:t xml:space="preserve">1:1</w:t>
-            </w:r>
-          </w:p>
-        </w:tc>
-        <w:tc>
-          <w:tcPr>
-            <w:tcW w:type="dxa" w:w="2400"/>
-            <w:shd w:fill="F5F5F5" w:val="clear"/>
-            <w:vAlign w:val="top"/>
-          </w:tcPr>
-          <w:p>
-            <w:pPr>
-              <w:shd w:fill="1A2744" w:val="clear"/>
-              <w:spacing w:after="60" w:before="60"/>
-              <w:jc w:val="center"/>
-            </w:pPr>
-            <w:r>
-              <w:rPr>
-                <w:b/>
-                <w:bCs/>
-                <w:color w:val="FFFFFF"/>
-                <w:sz w:val="18"/>
-                <w:szCs w:val="18"/>
-                <w:highlight w:val="darkBlue"/>
-                <w:highlightCs w:val="darkBlue"/>
-              </w:rPr>
-              <w:t xml:space="preserve">Coach</w:t>
-            </w:r>
-          </w:p>
-          <w:p>
-            <w:pPr>
-              <w:spacing w:after="30" w:before="30"/>
-              <w:ind w:left="80"/>
-            </w:pPr>
-            <w:r>
-              <w:rPr>
-                <w:color w:val="9D7A3A"/>
-                <w:sz w:val="16"/>
-                <w:szCs w:val="16"/>
-              </w:rPr>
-              <w:t xml:space="preserve">🔑 id</w:t>
-            </w:r>
-          </w:p>
-          <w:p>
-            <w:pPr>
-              <w:spacing w:after="30" w:before="30"/>
-              <w:ind w:left="80"/>
-            </w:pPr>
-            <w:r>
-              <w:rPr>
-                <w:color w:val="1565C0"/>
-                <w:sz w:val="16"/>
-                <w:szCs w:val="16"/>
-              </w:rPr>
-              <w:t xml:space="preserve">🔗 userId</w:t>
-            </w:r>
-          </w:p>
-          <w:p>
-            <w:pPr>
-              <w:spacing w:after="30" w:before="30"/>
-              <w:ind w:left="80"/>
-            </w:pPr>
-            <w:r>
-              <w:rPr>
-                <w:color w:val="333333"/>
-                <w:sz w:val="16"/>
-                <w:szCs w:val="16"/>
-              </w:rPr>
-              <w:t xml:space="preserve">bio</w:t>
-            </w:r>
-          </w:p>
-          <w:p>
-            <w:pPr>
-              <w:spacing w:after="30" w:before="30"/>
-              <w:ind w:left="80"/>
-            </w:pPr>
-            <w:r>
-              <w:rPr>
-                <w:color w:val="333333"/>
-                <w:sz w:val="16"/>
-                <w:szCs w:val="16"/>
-              </w:rPr>
-              <w:t xml:space="preserve">publicProfileName</w:t>
-            </w:r>
-          </w:p>
-        </w:tc>
-        <w:tc>
-          <w:tcPr>
-            <w:tcW w:type="dxa" w:w="480"/>
-            <w:vAlign w:val="center"/>
-          </w:tcPr>
-          <w:p>
-            <w:pPr>
-              <w:jc w:val="center"/>
-            </w:pPr>
-            <w:r>
-              <w:rPr>
-                <w:b/>
-                <w:bCs/>
-                <w:color w:val="9D7A3A"/>
-                <w:sz w:val="18"/>
-                <w:szCs w:val="18"/>
-              </w:rPr>
-              <w:t xml:space="preserve">1:N</w:t>
-            </w:r>
-          </w:p>
-        </w:tc>
-        <w:tc>
-          <w:tcPr>
-            <w:tcW w:type="dxa" w:w="2400"/>
-            <w:shd w:fill="F5F5F5" w:val="clear"/>
-            <w:vAlign w:val="top"/>
-          </w:tcPr>
-          <w:p>
-            <w:pPr>
-              <w:shd w:fill="1A2744" w:val="clear"/>
-              <w:spacing w:after="60" w:before="60"/>
-              <w:jc w:val="center"/>
-            </w:pPr>
-            <w:r>
-              <w:rPr>
-                <w:b/>
-                <w:bCs/>
-                <w:color w:val="FFFFFF"/>
-                <w:sz w:val="18"/>
-                <w:szCs w:val="18"/>
-                <w:highlight w:val="darkBlue"/>
-                <w:highlightCs w:val="darkBlue"/>
-              </w:rPr>
-              <w:t xml:space="preserve">Client</w:t>
-            </w:r>
-          </w:p>
-          <w:p>
-            <w:pPr>
-              <w:spacing w:after="30" w:before="30"/>
-              <w:ind w:left="80"/>
-            </w:pPr>
-            <w:r>
-              <w:rPr>
-                <w:color w:val="9D7A3A"/>
-                <w:sz w:val="16"/>
-                <w:szCs w:val="16"/>
-              </w:rPr>
-              <w:t xml:space="preserve">🔑 id</w:t>
-            </w:r>
-          </w:p>
-          <w:p>
-            <w:pPr>
-              <w:spacing w:after="30" w:before="30"/>
-              <w:ind w:left="80"/>
-            </w:pPr>
-            <w:r>
-              <w:rPr>
-                <w:color w:val="1565C0"/>
-                <w:sz w:val="16"/>
-                <w:szCs w:val="16"/>
-              </w:rPr>
-              <w:t xml:space="preserve">🔗 userId</w:t>
-            </w:r>
-          </w:p>
-          <w:p>
-            <w:pPr>
-              <w:spacing w:after="30" w:before="30"/>
-              <w:ind w:left="80"/>
-            </w:pPr>
-            <w:r>
-              <w:rPr>
-                <w:color w:val="1565C0"/>
-                <w:sz w:val="16"/>
-                <w:szCs w:val="16"/>
-              </w:rPr>
-              <w:t xml:space="preserve">🔗 coachId</w:t>
-            </w:r>
-          </w:p>
-        </w:tc>
-        <w:tc>
-          <w:tcPr>
-            <w:tcW w:type="dxa" w:w="480"/>
-            <w:vAlign w:val="center"/>
-          </w:tcPr>
-          <w:p>
-            <w:pPr>
-              <w:jc w:val="center"/>
-            </w:pPr>
-            <w:r>
-              <w:rPr>
-                <w:b/>
-                <w:bCs/>
-                <w:color w:val="9D7A3A"/>
-                <w:sz w:val="18"/>
-                <w:szCs w:val="18"/>
-              </w:rPr>
-              <w:t xml:space="preserve">1:N</w:t>
-            </w:r>
-          </w:p>
-        </w:tc>
-        <w:tc>
-          <w:tcPr>
-            <w:tcW w:type="dxa" w:w="2400"/>
-            <w:shd w:fill="F5F5F5" w:val="clear"/>
-            <w:vAlign w:val="top"/>
-          </w:tcPr>
-          <w:p>
-            <w:pPr>
-              <w:shd w:fill="1A2744" w:val="clear"/>
-              <w:spacing w:after="60" w:before="60"/>
-              <w:jc w:val="center"/>
-            </w:pPr>
-            <w:r>
-              <w:rPr>
-                <w:b/>
-                <w:bCs/>
-                <w:color w:val="FFFFFF"/>
-                <w:sz w:val="18"/>
-                <w:szCs w:val="18"/>
-                <w:highlight w:val="darkBlue"/>
-                <w:highlightCs w:val="darkBlue"/>
-              </w:rPr>
-              <w:t xml:space="preserve">Request</w:t>
-            </w:r>
-          </w:p>
-          <w:p>
-            <w:pPr>
-              <w:spacing w:after="30" w:before="30"/>
-              <w:ind w:left="80"/>
-            </w:pPr>
-            <w:r>
-              <w:rPr>
-                <w:color w:val="9D7A3A"/>
-                <w:sz w:val="16"/>
-                <w:szCs w:val="16"/>
-              </w:rPr>
-              <w:t xml:space="preserve">🔑 id</w:t>
-            </w:r>
-          </w:p>
-          <w:p>
-            <w:pPr>
-              <w:spacing w:after="30" w:before="30"/>
-              <w:ind w:left="80"/>
-            </w:pPr>
-            <w:r>
-              <w:rPr>
-                <w:color w:val="1565C0"/>
-                <w:sz w:val="16"/>
-                <w:szCs w:val="16"/>
-              </w:rPr>
-              <w:t xml:space="preserve">🔗 clientId</w:t>
-            </w:r>
-          </w:p>
-          <w:p>
-            <w:pPr>
-              <w:spacing w:after="30" w:before="30"/>
-              <w:ind w:left="80"/>
-            </w:pPr>
-            <w:r>
-              <w:rPr>
-                <w:color w:val="1565C0"/>
-                <w:sz w:val="16"/>
-                <w:szCs w:val="16"/>
-              </w:rPr>
-              <w:t xml:space="preserve">🔗 coachId</w:t>
-            </w:r>
-          </w:p>
-          <w:p>
-            <w:pPr>
-              <w:spacing w:after="30" w:before="30"/>
-              <w:ind w:left="80"/>
-            </w:pPr>
-            <w:r>
-              <w:rPr>
-                <w:color w:val="333333"/>
-                <w:sz w:val="16"/>
-                <w:szCs w:val="16"/>
-              </w:rPr>
-              <w:t xml:space="preserve">message</w:t>
-            </w:r>
-          </w:p>
-          <w:p>
-            <w:pPr>
-              <w:spacing w:after="30" w:before="30"/>
-              <w:ind w:left="80"/>
-            </w:pPr>
-            <w:r>
-              <w:rPr>
-                <w:color w:val="333333"/>
-                <w:sz w:val="16"/>
-                <w:szCs w:val="16"/>
-              </w:rPr>
-              <w:t xml:space="preserve">status</w:t>
-            </w:r>
-          </w:p>
-        </w:tc>
-      </w:tr>
-    </w:tbl>
-    <w:p>
-      <w:pPr>
-        <w:spacing w:after="60" w:before="60"/>
-        <w:jc w:val="center"/>
-      </w:pPr>
-      <w:r>
-        <w:rPr>
-          <w:b/>
-          <w:bCs/>
-          <w:color w:val="9D7A3A"/>
+          <w:i/>
+          <w:iCs/>
+          <w:color w:val="666666"/>
           <w:sz w:val="18"/>
           <w:szCs w:val="18"/>
         </w:rPr>
-        <w:t xml:space="preserve">▼  1:N  ▼</w:t>
+        <w:t xml:space="preserve">Figure 2 — Diagramme Entités-Relations Ybuddy</w:t>
       </w:r>
-    </w:p>
-    <w:tbl>
-      <w:tblPr>
-        <w:tblW w:type="dxa" w:w="10080"/>
-        <w:tblBorders>
-          <w:top w:val="single" w:color="auto" w:sz="4"/>
-          <w:left w:val="single" w:color="auto" w:sz="4"/>
-          <w:bottom w:val="single" w:color="auto" w:sz="4"/>
-          <w:right w:val="single" w:color="auto" w:sz="4"/>
-          <w:insideH w:val="single" w:color="auto" w:sz="4"/>
-          <w:insideV w:val="single" w:color="auto" w:sz="4"/>
-        </w:tblBorders>
-      </w:tblPr>
-      <w:tblGrid>
-        <w:gridCol w:w="2400"/>
-        <w:gridCol w:w="480"/>
-        <w:gridCol w:w="2400"/>
-        <w:gridCol w:w="480"/>
-        <w:gridCol w:w="2400"/>
-        <w:gridCol w:w="480"/>
-        <w:gridCol w:w="2400"/>
-      </w:tblGrid>
-      <w:tr>
-        <w:tc>
-          <w:tcPr>
-            <w:tcW w:type="dxa" w:w="2400"/>
-            <w:shd w:fill="F5F5F5" w:val="clear"/>
-            <w:vAlign w:val="top"/>
-          </w:tcPr>
-          <w:p>
-            <w:pPr>
-              <w:shd w:fill="1A2744" w:val="clear"/>
-              <w:spacing w:after="60" w:before="60"/>
-              <w:jc w:val="center"/>
-            </w:pPr>
-            <w:r>
-              <w:rPr>
-                <w:b/>
-                <w:bCs/>
-                <w:color w:val="FFFFFF"/>
-                <w:sz w:val="18"/>
-                <w:szCs w:val="18"/>
-                <w:highlight w:val="darkBlue"/>
-                <w:highlightCs w:val="darkBlue"/>
-              </w:rPr>
-              <w:t xml:space="preserve">Exercise</w:t>
-            </w:r>
-          </w:p>
-          <w:p>
-            <w:pPr>
-              <w:spacing w:after="30" w:before="30"/>
-              <w:ind w:left="80"/>
-            </w:pPr>
-            <w:r>
-              <w:rPr>
-                <w:color w:val="9D7A3A"/>
-                <w:sz w:val="16"/>
-                <w:szCs w:val="16"/>
-              </w:rPr>
-              <w:t xml:space="preserve">🔑 id</w:t>
-            </w:r>
-          </w:p>
-          <w:p>
-            <w:pPr>
-              <w:spacing w:after="30" w:before="30"/>
-              <w:ind w:left="80"/>
-            </w:pPr>
-            <w:r>
-              <w:rPr>
-                <w:color w:val="333333"/>
-                <w:sz w:val="16"/>
-                <w:szCs w:val="16"/>
-              </w:rPr>
-              <w:t xml:space="preserve">name (unique)</w:t>
-            </w:r>
-          </w:p>
-          <w:p>
-            <w:pPr>
-              <w:spacing w:after="30" w:before="30"/>
-              <w:ind w:left="80"/>
-            </w:pPr>
-            <w:r>
-              <w:rPr>
-                <w:color w:val="333333"/>
-                <w:sz w:val="16"/>
-                <w:szCs w:val="16"/>
-              </w:rPr>
-              <w:t xml:space="preserve">muscleGroup</w:t>
-            </w:r>
-          </w:p>
-          <w:p>
-            <w:pPr>
-              <w:spacing w:after="30" w:before="30"/>
-              <w:ind w:left="80"/>
-            </w:pPr>
-            <w:r>
-              <w:rPr>
-                <w:color w:val="333333"/>
-                <w:sz w:val="16"/>
-                <w:szCs w:val="16"/>
-              </w:rPr>
-              <w:t xml:space="preserve">videoUrl</w:t>
-            </w:r>
-          </w:p>
-          <w:p>
-            <w:pPr>
-              <w:spacing w:after="30" w:before="30"/>
-              <w:ind w:left="80"/>
-            </w:pPr>
-            <w:r>
-              <w:rPr>
-                <w:color w:val="333333"/>
-                <w:sz w:val="16"/>
-                <w:szCs w:val="16"/>
-              </w:rPr>
-              <w:t xml:space="preserve">gifUrl</w:t>
-            </w:r>
-          </w:p>
-          <w:p>
-            <w:pPr>
-              <w:spacing w:after="30" w:before="30"/>
-              <w:ind w:left="80"/>
-            </w:pPr>
-            <w:r>
-              <w:rPr>
-                <w:color w:val="333333"/>
-                <w:sz w:val="16"/>
-                <w:szCs w:val="16"/>
-              </w:rPr>
-              <w:t xml:space="preserve">description</w:t>
-            </w:r>
-          </w:p>
-          <w:p>
-            <w:pPr>
-              <w:spacing w:after="30" w:before="30"/>
-              <w:ind w:left="80"/>
-            </w:pPr>
-            <w:r>
-              <w:rPr>
-                <w:color w:val="333333"/>
-                <w:sz w:val="16"/>
-                <w:szCs w:val="16"/>
-              </w:rPr>
-              <w:t xml:space="preserve">instructions</w:t>
-            </w:r>
-          </w:p>
-        </w:tc>
-        <w:tc>
-          <w:tcPr>
-            <w:tcW w:type="dxa" w:w="480"/>
-            <w:vAlign w:val="center"/>
-          </w:tcPr>
-          <w:p>
-            <w:pPr>
-              <w:jc w:val="center"/>
-            </w:pPr>
-            <w:r>
-              <w:rPr>
-                <w:b/>
-                <w:bCs/>
-                <w:color w:val="9D7A3A"/>
-                <w:sz w:val="18"/>
-                <w:szCs w:val="18"/>
-              </w:rPr>
-              <w:t xml:space="preserve">N:N →</w:t>
-            </w:r>
-          </w:p>
-        </w:tc>
-        <w:tc>
-          <w:tcPr>
-            <w:tcW w:type="dxa" w:w="2400"/>
-            <w:shd w:fill="F5F5F5" w:val="clear"/>
-            <w:vAlign w:val="top"/>
-          </w:tcPr>
-          <w:p>
-            <w:pPr>
-              <w:shd w:fill="1A2744" w:val="clear"/>
-              <w:spacing w:after="60" w:before="60"/>
-              <w:jc w:val="center"/>
-            </w:pPr>
-            <w:r>
-              <w:rPr>
-                <w:b/>
-                <w:bCs/>
-                <w:color w:val="FFFFFF"/>
-                <w:sz w:val="18"/>
-                <w:szCs w:val="18"/>
-                <w:highlight w:val="darkBlue"/>
-                <w:highlightCs w:val="darkBlue"/>
-              </w:rPr>
-              <w:t xml:space="preserve">Program</w:t>
-            </w:r>
-          </w:p>
-          <w:p>
-            <w:pPr>
-              <w:spacing w:after="30" w:before="30"/>
-              <w:ind w:left="80"/>
-            </w:pPr>
-            <w:r>
-              <w:rPr>
-                <w:color w:val="9D7A3A"/>
-                <w:sz w:val="16"/>
-                <w:szCs w:val="16"/>
-              </w:rPr>
-              <w:t xml:space="preserve">🔑 id</w:t>
-            </w:r>
-          </w:p>
-          <w:p>
-            <w:pPr>
-              <w:spacing w:after="30" w:before="30"/>
-              <w:ind w:left="80"/>
-            </w:pPr>
-            <w:r>
-              <w:rPr>
-                <w:color w:val="1565C0"/>
-                <w:sz w:val="16"/>
-                <w:szCs w:val="16"/>
-              </w:rPr>
-              <w:t xml:space="preserve">🔗 coachId</w:t>
-            </w:r>
-          </w:p>
-          <w:p>
-            <w:pPr>
-              <w:spacing w:after="30" w:before="30"/>
-              <w:ind w:left="80"/>
-            </w:pPr>
-            <w:r>
-              <w:rPr>
-                <w:color w:val="1565C0"/>
-                <w:sz w:val="16"/>
-                <w:szCs w:val="16"/>
-              </w:rPr>
-              <w:t xml:space="preserve">🔗 clientId</w:t>
-            </w:r>
-          </w:p>
-          <w:p>
-            <w:pPr>
-              <w:spacing w:after="30" w:before="30"/>
-              <w:ind w:left="80"/>
-            </w:pPr>
-            <w:r>
-              <w:rPr>
-                <w:color w:val="333333"/>
-                <w:sz w:val="16"/>
-                <w:szCs w:val="16"/>
-              </w:rPr>
-              <w:t xml:space="preserve">duration</w:t>
-            </w:r>
-          </w:p>
-          <w:p>
-            <w:pPr>
-              <w:spacing w:after="30" w:before="30"/>
-              <w:ind w:left="80"/>
-            </w:pPr>
-            <w:r>
-              <w:rPr>
-                <w:color w:val="333333"/>
-                <w:sz w:val="16"/>
-                <w:szCs w:val="16"/>
-              </w:rPr>
-              <w:t xml:space="preserve">sent (bool)</w:t>
-            </w:r>
-          </w:p>
-          <w:p>
-            <w:pPr>
-              <w:spacing w:after="30" w:before="30"/>
-              <w:ind w:left="80"/>
-            </w:pPr>
-            <w:r>
-              <w:rPr>
-                <w:color w:val="333333"/>
-                <w:sz w:val="16"/>
-                <w:szCs w:val="16"/>
-              </w:rPr>
-              <w:t xml:space="preserve">createdAt</w:t>
-            </w:r>
-          </w:p>
-        </w:tc>
-        <w:tc>
-          <w:tcPr>
-            <w:tcW w:type="dxa" w:w="480"/>
-            <w:vAlign w:val="center"/>
-          </w:tcPr>
-          <w:p>
-            <w:pPr>
-              <w:jc w:val="center"/>
-            </w:pPr>
-            <w:r>
-              <w:rPr>
-                <w:b/>
-                <w:bCs/>
-                <w:color w:val="9D7A3A"/>
-                <w:sz w:val="18"/>
-                <w:szCs w:val="18"/>
-              </w:rPr>
-              <w:t xml:space="preserve">1:N</w:t>
-            </w:r>
-          </w:p>
-        </w:tc>
-        <w:tc>
-          <w:tcPr>
-            <w:tcW w:type="dxa" w:w="2400"/>
-            <w:shd w:fill="F5F5F5" w:val="clear"/>
-            <w:vAlign w:val="top"/>
-          </w:tcPr>
-          <w:p>
-            <w:pPr>
-              <w:shd w:fill="1A2744" w:val="clear"/>
-              <w:spacing w:after="60" w:before="60"/>
-              <w:jc w:val="center"/>
-            </w:pPr>
-            <w:r>
-              <w:rPr>
-                <w:b/>
-                <w:bCs/>
-                <w:color w:val="FFFFFF"/>
-                <w:sz w:val="18"/>
-                <w:szCs w:val="18"/>
-                <w:highlight w:val="darkBlue"/>
-                <w:highlightCs w:val="darkBlue"/>
-              </w:rPr>
-              <w:t xml:space="preserve">ProgramDay</w:t>
-            </w:r>
-          </w:p>
-          <w:p>
-            <w:pPr>
-              <w:spacing w:after="30" w:before="30"/>
-              <w:ind w:left="80"/>
-            </w:pPr>
-            <w:r>
-              <w:rPr>
-                <w:color w:val="9D7A3A"/>
-                <w:sz w:val="16"/>
-                <w:szCs w:val="16"/>
-              </w:rPr>
-              <w:t xml:space="preserve">🔑 id</w:t>
-            </w:r>
-          </w:p>
-          <w:p>
-            <w:pPr>
-              <w:spacing w:after="30" w:before="30"/>
-              <w:ind w:left="80"/>
-            </w:pPr>
-            <w:r>
-              <w:rPr>
-                <w:color w:val="1565C0"/>
-                <w:sz w:val="16"/>
-                <w:szCs w:val="16"/>
-              </w:rPr>
-              <w:t xml:space="preserve">🔗 programId</w:t>
-            </w:r>
-          </w:p>
-          <w:p>
-            <w:pPr>
-              <w:spacing w:after="30" w:before="30"/>
-              <w:ind w:left="80"/>
-            </w:pPr>
-            <w:r>
-              <w:rPr>
-                <w:color w:val="333333"/>
-                <w:sz w:val="16"/>
-                <w:szCs w:val="16"/>
-              </w:rPr>
-              <w:t xml:space="preserve">dayNumber</w:t>
-            </w:r>
-          </w:p>
-          <w:p>
-            <w:pPr>
-              <w:spacing w:after="30" w:before="30"/>
-              <w:ind w:left="80"/>
-            </w:pPr>
-            <w:r>
-              <w:rPr>
-                <w:color w:val="333333"/>
-                <w:sz w:val="16"/>
-                <w:szCs w:val="16"/>
-              </w:rPr>
-              <w:t xml:space="preserve">type (workout/rest)</w:t>
-            </w:r>
-          </w:p>
-        </w:tc>
-        <w:tc>
-          <w:tcPr>
-            <w:tcW w:type="dxa" w:w="480"/>
-            <w:vAlign w:val="center"/>
-          </w:tcPr>
-          <w:p>
-            <w:pPr>
-              <w:jc w:val="center"/>
-            </w:pPr>
-            <w:r>
-              <w:rPr>
-                <w:b/>
-                <w:bCs/>
-                <w:color w:val="9D7A3A"/>
-                <w:sz w:val="18"/>
-                <w:szCs w:val="18"/>
-              </w:rPr>
-              <w:t xml:space="preserve">1:N</w:t>
-            </w:r>
-          </w:p>
-        </w:tc>
-        <w:tc>
-          <w:tcPr>
-            <w:tcW w:type="dxa" w:w="2400"/>
-            <w:shd w:fill="F5F5F5" w:val="clear"/>
-            <w:vAlign w:val="top"/>
-          </w:tcPr>
-          <w:p>
-            <w:pPr>
-              <w:shd w:fill="1A2744" w:val="clear"/>
-              <w:spacing w:after="60" w:before="60"/>
-              <w:jc w:val="center"/>
-            </w:pPr>
-            <w:r>
-              <w:rPr>
-                <w:b/>
-                <w:bCs/>
-                <w:color w:val="FFFFFF"/>
-                <w:sz w:val="18"/>
-                <w:szCs w:val="18"/>
-                <w:highlight w:val="darkBlue"/>
-                <w:highlightCs w:val="darkBlue"/>
-              </w:rPr>
-              <w:t xml:space="preserve">ProgramExercise</w:t>
-            </w:r>
-          </w:p>
-          <w:p>
-            <w:pPr>
-              <w:spacing w:after="30" w:before="30"/>
-              <w:ind w:left="80"/>
-            </w:pPr>
-            <w:r>
-              <w:rPr>
-                <w:color w:val="9D7A3A"/>
-                <w:sz w:val="16"/>
-                <w:szCs w:val="16"/>
-              </w:rPr>
-              <w:t xml:space="preserve">🔑 id</w:t>
-            </w:r>
-          </w:p>
-          <w:p>
-            <w:pPr>
-              <w:spacing w:after="30" w:before="30"/>
-              <w:ind w:left="80"/>
-            </w:pPr>
-            <w:r>
-              <w:rPr>
-                <w:color w:val="1565C0"/>
-                <w:sz w:val="16"/>
-                <w:szCs w:val="16"/>
-              </w:rPr>
-              <w:t xml:space="preserve">🔗 dayId</w:t>
-            </w:r>
-          </w:p>
-          <w:p>
-            <w:pPr>
-              <w:spacing w:after="30" w:before="30"/>
-              <w:ind w:left="80"/>
-            </w:pPr>
-            <w:r>
-              <w:rPr>
-                <w:color w:val="1565C0"/>
-                <w:sz w:val="16"/>
-                <w:szCs w:val="16"/>
-              </w:rPr>
-              <w:t xml:space="preserve">🔗 exerciseId</w:t>
-            </w:r>
-          </w:p>
-          <w:p>
-            <w:pPr>
-              <w:spacing w:after="30" w:before="30"/>
-              <w:ind w:left="80"/>
-            </w:pPr>
-            <w:r>
-              <w:rPr>
-                <w:color w:val="333333"/>
-                <w:sz w:val="16"/>
-                <w:szCs w:val="16"/>
-              </w:rPr>
-              <w:t xml:space="preserve">sets</w:t>
-            </w:r>
-          </w:p>
-          <w:p>
-            <w:pPr>
-              <w:spacing w:after="30" w:before="30"/>
-              <w:ind w:left="80"/>
-            </w:pPr>
-            <w:r>
-              <w:rPr>
-                <w:color w:val="333333"/>
-                <w:sz w:val="16"/>
-                <w:szCs w:val="16"/>
-              </w:rPr>
-              <w:t xml:space="preserve">reps</w:t>
-            </w:r>
-          </w:p>
-          <w:p>
-            <w:pPr>
-              <w:spacing w:after="30" w:before="30"/>
-              <w:ind w:left="80"/>
-            </w:pPr>
-            <w:r>
-              <w:rPr>
-                <w:color w:val="333333"/>
-                <w:sz w:val="16"/>
-                <w:szCs w:val="16"/>
-              </w:rPr>
-              <w:t xml:space="preserve">(table de liaison)</w:t>
-            </w:r>
-          </w:p>
-        </w:tc>
-      </w:tr>
-    </w:tbl>
-    <w:p>
-      <w:pPr>
-        <w:spacing w:after="120"/>
-      </w:pPr>
     </w:p>
     <w:p>
       <w:pPr>
@@ -20062,7 +18578,7 @@
         <w:spacing w:after="110" w:before="220"/>
       </w:pPr>
       <w:r>
-        <w:t xml:space="preserve">8.4 Diagramme de séquence — Flux JWT</w:t>
+        <w:t xml:space="preserve">8.4 Diagramme de séquence — Flux clé Ybuddy</w:t>
       </w:r>
     </w:p>
     <w:p>
@@ -20074,7 +18590,7 @@
           <w:sz w:val="20"/>
           <w:szCs w:val="20"/>
         </w:rPr>
-        <w:t xml:space="preserve">Illustration du flux d'authentification de la saisie jusqu'à l'obtention du token JWT :</w:t>
+        <w:t xml:space="preserve">Illustration du flux complet : le client soumet une demande → le coach reçoit une notification → crée le programme → le client reçoit son programme.</w:t>
       </w:r>
     </w:p>
     <w:p>
@@ -20084,1206 +18600,65 @@
     </w:p>
     <w:p>
       <w:pPr>
-        <w:spacing w:after="80" w:before="80"/>
+        <w:spacing w:after="60" w:before="80"/>
+        <w:jc w:val="center"/>
+      </w:pPr>
+      <w:r>
+        <w:drawing>
+          <wp:inline distT="0" distB="0" distL="0" distR="0">
+            <wp:extent cx="5905500" cy="2952750"/>
+            <wp:effectExtent t="0" r="0" b="0" l="0"/>
+            <wp:docPr id="1" name="" descr="" title=""/>
+            <wp:cNvGraphicFramePr>
+              <a:graphicFrameLocks xmlns:a="http://schemas.openxmlformats.org/drawingml/2006/main" noChangeAspect="1"/>
+            </wp:cNvGraphicFramePr>
+            <a:graphic xmlns:a="http://schemas.openxmlformats.org/drawingml/2006/main">
+              <a:graphicData uri="http://schemas.openxmlformats.org/drawingml/2006/picture">
+                <pic:pic xmlns:pic="http://schemas.openxmlformats.org/drawingml/2006/picture">
+                  <pic:nvPicPr>
+                    <pic:cNvPr id="0" name="" descr=""/>
+                    <pic:cNvPicPr>
+                      <a:picLocks noChangeAspect="1" noChangeArrowheads="1"/>
+                    </pic:cNvPicPr>
+                  </pic:nvPicPr>
+                  <pic:blipFill>
+                    <a:blip r:embed="rId9" cstate="none"/>
+                    <a:srcRect/>
+                    <a:stretch>
+                      <a:fillRect/>
+                    </a:stretch>
+                  </pic:blipFill>
+                  <pic:spPr bwMode="auto">
+                    <a:xfrm>
+                      <a:off x="0" y="0"/>
+                      <a:ext cx="5905500" cy="2952750"/>
+                    </a:xfrm>
+                    <a:prstGeom prst="rect">
+                      <a:avLst/>
+                    </a:prstGeom>
+                  </pic:spPr>
+                </pic:pic>
+              </a:graphicData>
+            </a:graphic>
+          </wp:inline>
+        </w:drawing>
+      </w:r>
+    </w:p>
+    <w:p>
+      <w:pPr>
+        <w:spacing w:after="120"/>
         <w:jc w:val="center"/>
       </w:pPr>
       <w:r>
         <w:rPr>
-          <w:b/>
-          <w:bCs/>
-          <w:color w:val="1A2744"/>
-          <w:sz w:val="22"/>
-          <w:szCs w:val="22"/>
+          <w:i/>
+          <w:iCs/>
+          <w:color w:val="666666"/>
+          <w:sz w:val="18"/>
+          <w:szCs w:val="18"/>
         </w:rPr>
-        <w:t xml:space="preserve">Diagramme de Séquence — Authentification JWT</w:t>
+        <w:t xml:space="preserve">Figure 3 — Diagramme de séquence UML (flux de coaching complet)</w:t>
       </w:r>
-    </w:p>
-    <w:tbl>
-      <w:tblPr>
-        <w:tblW w:type="dxa" w:w="9300"/>
-        <w:tblBorders>
-          <w:top w:val="single" w:color="auto" w:sz="4"/>
-          <w:left w:val="single" w:color="auto" w:sz="4"/>
-          <w:bottom w:val="single" w:color="auto" w:sz="4"/>
-          <w:right w:val="single" w:color="auto" w:sz="4"/>
-          <w:insideH w:val="single" w:color="auto" w:sz="4"/>
-          <w:insideV w:val="single" w:color="auto" w:sz="4"/>
-        </w:tblBorders>
-      </w:tblPr>
-      <w:tblGrid>
-        <w:gridCol w:w="1500"/>
-        <w:gridCol w:w="2000"/>
-        <w:gridCol w:w="2000"/>
-        <w:gridCol w:w="2000"/>
-        <w:gridCol w:w="1800"/>
-      </w:tblGrid>
-      <w:tr>
-        <w:tc>
-          <w:tcPr>
-            <w:tcW w:type="dxa" w:w="1500"/>
-            <w:shd w:fill="E3F2FD" w:val="clear"/>
-          </w:tcPr>
-          <w:p>
-            <w:pPr>
-              <w:spacing w:after="80" w:before="80"/>
-              <w:jc w:val="center"/>
-            </w:pPr>
-            <w:r>
-              <w:rPr>
-                <w:b/>
-                <w:bCs/>
-                <w:color w:val="1565C0"/>
-                <w:sz w:val="18"/>
-                <w:szCs w:val="18"/>
-              </w:rPr>
-              <w:t xml:space="preserve">Utilisateur</w:t>
-            </w:r>
-          </w:p>
-        </w:tc>
-        <w:tc>
-          <w:tcPr>
-            <w:tcW w:type="dxa" w:w="2000"/>
-            <w:shd w:fill="FFF3E0" w:val="clear"/>
-          </w:tcPr>
-          <w:p>
-            <w:pPr>
-              <w:spacing w:after="80" w:before="80"/>
-              <w:jc w:val="center"/>
-            </w:pPr>
-            <w:r>
-              <w:rPr>
-                <w:b/>
-                <w:bCs/>
-                <w:color w:val="1A2744"/>
-                <w:sz w:val="18"/>
-                <w:szCs w:val="18"/>
-              </w:rPr>
-              <w:t xml:space="preserve">React</w:t>
-            </w:r>
-            <w:r>
-              <w:rPr>
-                <w:sz w:val="18"/>
-                <w:szCs w:val="18"/>
-              </w:rPr>
-              <w:t xml:space="preserve">
-</w:t>
-            </w:r>
-            <w:r>
-              <w:rPr>
-                <w:b/>
-                <w:bCs/>
-                <w:color w:val="1A2744"/>
-                <w:sz w:val="18"/>
-                <w:szCs w:val="18"/>
-              </w:rPr>
-              <w:t xml:space="preserve">(Frontend)</w:t>
-            </w:r>
-          </w:p>
-        </w:tc>
-        <w:tc>
-          <w:tcPr>
-            <w:tcW w:type="dxa" w:w="2000"/>
-            <w:shd w:fill="FFF3E0" w:val="clear"/>
-          </w:tcPr>
-          <w:p>
-            <w:pPr>
-              <w:spacing w:after="80" w:before="80"/>
-              <w:jc w:val="center"/>
-            </w:pPr>
-            <w:r>
-              <w:rPr>
-                <w:b/>
-                <w:bCs/>
-                <w:color w:val="1A2744"/>
-                <w:sz w:val="18"/>
-                <w:szCs w:val="18"/>
-              </w:rPr>
-              <w:t xml:space="preserve">AuthController</w:t>
-            </w:r>
-            <w:r>
-              <w:rPr>
-                <w:sz w:val="18"/>
-                <w:szCs w:val="18"/>
-              </w:rPr>
-              <w:t xml:space="preserve">
-</w:t>
-            </w:r>
-            <w:r>
-              <w:rPr>
-                <w:b/>
-                <w:bCs/>
-                <w:color w:val="1A2744"/>
-                <w:sz w:val="18"/>
-                <w:szCs w:val="18"/>
-              </w:rPr>
-              <w:t xml:space="preserve">(NestJS)</w:t>
-            </w:r>
-          </w:p>
-        </w:tc>
-        <w:tc>
-          <w:tcPr>
-            <w:tcW w:type="dxa" w:w="2000"/>
-            <w:shd w:fill="FFF3E0" w:val="clear"/>
-          </w:tcPr>
-          <w:p>
-            <w:pPr>
-              <w:spacing w:after="80" w:before="80"/>
-              <w:jc w:val="center"/>
-            </w:pPr>
-            <w:r>
-              <w:rPr>
-                <w:b/>
-                <w:bCs/>
-                <w:color w:val="1A2744"/>
-                <w:sz w:val="18"/>
-                <w:szCs w:val="18"/>
-              </w:rPr>
-              <w:t xml:space="preserve">AuthService</w:t>
-            </w:r>
-          </w:p>
-        </w:tc>
-        <w:tc>
-          <w:tcPr>
-            <w:tcW w:type="dxa" w:w="1800"/>
-            <w:shd w:fill="E8F5E9" w:val="clear"/>
-          </w:tcPr>
-          <w:p>
-            <w:pPr>
-              <w:spacing w:after="80" w:before="80"/>
-              <w:jc w:val="center"/>
-            </w:pPr>
-            <w:r>
-              <w:rPr>
-                <w:b/>
-                <w:bCs/>
-                <w:color w:val="2E7D32"/>
-                <w:sz w:val="18"/>
-                <w:szCs w:val="18"/>
-              </w:rPr>
-              <w:t xml:space="preserve">MariaDB</w:t>
-            </w:r>
-          </w:p>
-        </w:tc>
-      </w:tr>
-      <w:tr>
-        <w:tc>
-          <w:tcPr>
-            <w:tcW w:type="dxa" w:w="1500"/>
-          </w:tcPr>
-          <w:p>
-            <w:pPr>
-              <w:spacing w:after="40" w:before="40"/>
-              <w:jc w:val="left"/>
-            </w:pPr>
-            <w:r>
-              <w:rPr>
-                <w:b/>
-                <w:bCs/>
-                <w:color w:val="9D7A3A"/>
-                <w:sz w:val="16"/>
-                <w:szCs w:val="16"/>
-              </w:rPr>
-              <w:t xml:space="preserve"/>
-            </w:r>
-          </w:p>
-        </w:tc>
-        <w:tc>
-          <w:tcPr>
-            <w:tcW w:type="dxa" w:w="2000"/>
-          </w:tcPr>
-          <w:p>
-            <w:pPr>
-              <w:spacing w:after="40" w:before="40"/>
-              <w:jc w:val="right"/>
-            </w:pPr>
-            <w:r>
-              <w:rPr>
-                <w:b/>
-                <w:bCs/>
-                <w:color w:val="9D7A3A"/>
-                <w:sz w:val="16"/>
-                <w:szCs w:val="16"/>
-              </w:rPr>
-              <w:t xml:space="preserve"/>
-            </w:r>
-          </w:p>
-        </w:tc>
-        <w:tc>
-          <w:tcPr>
-            <w:tcW w:type="dxa" w:w="2000"/>
-          </w:tcPr>
-          <w:p/>
-        </w:tc>
-        <w:tc>
-          <w:tcPr>
-            <w:tcW w:type="dxa" w:w="2000"/>
-          </w:tcPr>
-          <w:p/>
-        </w:tc>
-        <w:tc>
-          <w:tcPr>
-            <w:tcW w:type="dxa" w:w="1800"/>
-          </w:tcPr>
-          <w:p/>
-        </w:tc>
-      </w:tr>
-      <w:tr>
-        <w:tc>
-          <w:tcPr>
-            <w:tcW w:type="dxa" w:w="9300"/>
-            <w:gridSpan w:val="5"/>
-          </w:tcPr>
-          <w:p>
-            <w:pPr>
-              <w:spacing w:after="40" w:before="0"/>
-              <w:ind w:left="100"/>
-              <w:jc w:val="left"/>
-            </w:pPr>
-            <w:r>
-              <w:rPr>
-                <w:i w:val="false"/>
-                <w:iCs w:val="false"/>
-                <w:color w:val="1A2744"/>
-                <w:sz w:val="15"/>
-                <w:szCs w:val="15"/>
-              </w:rPr>
-              <w:t xml:space="preserve">↪ Saisit email + mot de passe</w:t>
-            </w:r>
-          </w:p>
-        </w:tc>
-      </w:tr>
-      <w:tr>
-        <w:tc>
-          <w:tcPr>
-            <w:tcW w:type="dxa" w:w="1500"/>
-          </w:tcPr>
-          <w:p/>
-        </w:tc>
-        <w:tc>
-          <w:tcPr>
-            <w:tcW w:type="dxa" w:w="2000"/>
-          </w:tcPr>
-          <w:p>
-            <w:pPr>
-              <w:spacing w:after="40" w:before="40"/>
-              <w:jc w:val="left"/>
-            </w:pPr>
-            <w:r>
-              <w:rPr>
-                <w:b/>
-                <w:bCs/>
-                <w:color w:val="9D7A3A"/>
-                <w:sz w:val="16"/>
-                <w:szCs w:val="16"/>
-              </w:rPr>
-              <w:t xml:space="preserve"/>
-            </w:r>
-          </w:p>
-        </w:tc>
-        <w:tc>
-          <w:tcPr>
-            <w:tcW w:type="dxa" w:w="2000"/>
-          </w:tcPr>
-          <w:p>
-            <w:pPr>
-              <w:spacing w:after="40" w:before="40"/>
-              <w:jc w:val="right"/>
-            </w:pPr>
-            <w:r>
-              <w:rPr>
-                <w:b/>
-                <w:bCs/>
-                <w:color w:val="9D7A3A"/>
-                <w:sz w:val="16"/>
-                <w:szCs w:val="16"/>
-              </w:rPr>
-              <w:t xml:space="preserve"/>
-            </w:r>
-          </w:p>
-        </w:tc>
-        <w:tc>
-          <w:tcPr>
-            <w:tcW w:type="dxa" w:w="2000"/>
-          </w:tcPr>
-          <w:p/>
-        </w:tc>
-        <w:tc>
-          <w:tcPr>
-            <w:tcW w:type="dxa" w:w="1800"/>
-          </w:tcPr>
-          <w:p/>
-        </w:tc>
-      </w:tr>
-      <w:tr>
-        <w:tc>
-          <w:tcPr>
-            <w:tcW w:type="dxa" w:w="9300"/>
-            <w:gridSpan w:val="5"/>
-          </w:tcPr>
-          <w:p>
-            <w:pPr>
-              <w:spacing w:after="40" w:before="0"/>
-              <w:ind w:left="1600"/>
-              <w:jc w:val="left"/>
-            </w:pPr>
-            <w:r>
-              <w:rPr>
-                <w:i w:val="false"/>
-                <w:iCs w:val="false"/>
-                <w:color w:val="1A2744"/>
-                <w:sz w:val="15"/>
-                <w:szCs w:val="15"/>
-              </w:rPr>
-              <w:t xml:space="preserve">↪ POST /api/auth/login { email, password }</w:t>
-            </w:r>
-          </w:p>
-        </w:tc>
-      </w:tr>
-      <w:tr>
-        <w:tc>
-          <w:tcPr>
-            <w:tcW w:type="dxa" w:w="1500"/>
-          </w:tcPr>
-          <w:p/>
-        </w:tc>
-        <w:tc>
-          <w:tcPr>
-            <w:tcW w:type="dxa" w:w="2000"/>
-          </w:tcPr>
-          <w:p/>
-        </w:tc>
-        <w:tc>
-          <w:tcPr>
-            <w:tcW w:type="dxa" w:w="2000"/>
-          </w:tcPr>
-          <w:p>
-            <w:pPr>
-              <w:spacing w:after="40" w:before="40"/>
-              <w:jc w:val="left"/>
-            </w:pPr>
-            <w:r>
-              <w:rPr>
-                <w:b/>
-                <w:bCs/>
-                <w:color w:val="9D7A3A"/>
-                <w:sz w:val="16"/>
-                <w:szCs w:val="16"/>
-              </w:rPr>
-              <w:t xml:space="preserve"/>
-            </w:r>
-          </w:p>
-        </w:tc>
-        <w:tc>
-          <w:tcPr>
-            <w:tcW w:type="dxa" w:w="2000"/>
-          </w:tcPr>
-          <w:p>
-            <w:pPr>
-              <w:spacing w:after="40" w:before="40"/>
-              <w:jc w:val="right"/>
-            </w:pPr>
-            <w:r>
-              <w:rPr>
-                <w:b/>
-                <w:bCs/>
-                <w:color w:val="9D7A3A"/>
-                <w:sz w:val="16"/>
-                <w:szCs w:val="16"/>
-              </w:rPr>
-              <w:t xml:space="preserve"/>
-            </w:r>
-          </w:p>
-        </w:tc>
-        <w:tc>
-          <w:tcPr>
-            <w:tcW w:type="dxa" w:w="1800"/>
-          </w:tcPr>
-          <w:p/>
-        </w:tc>
-      </w:tr>
-      <w:tr>
-        <w:tc>
-          <w:tcPr>
-            <w:tcW w:type="dxa" w:w="9300"/>
-            <w:gridSpan w:val="5"/>
-          </w:tcPr>
-          <w:p>
-            <w:pPr>
-              <w:spacing w:after="40" w:before="0"/>
-              <w:ind w:left="3600"/>
-              <w:jc w:val="left"/>
-            </w:pPr>
-            <w:r>
-              <w:rPr>
-                <w:i w:val="false"/>
-                <w:iCs w:val="false"/>
-                <w:color w:val="1A2744"/>
-                <w:sz w:val="15"/>
-                <w:szCs w:val="15"/>
-              </w:rPr>
-              <w:t xml:space="preserve">↪ validateUser(email, password)</w:t>
-            </w:r>
-          </w:p>
-        </w:tc>
-      </w:tr>
-      <w:tr>
-        <w:tc>
-          <w:tcPr>
-            <w:tcW w:type="dxa" w:w="1500"/>
-          </w:tcPr>
-          <w:p/>
-        </w:tc>
-        <w:tc>
-          <w:tcPr>
-            <w:tcW w:type="dxa" w:w="2000"/>
-          </w:tcPr>
-          <w:p/>
-        </w:tc>
-        <w:tc>
-          <w:tcPr>
-            <w:tcW w:type="dxa" w:w="2000"/>
-          </w:tcPr>
-          <w:p/>
-        </w:tc>
-        <w:tc>
-          <w:tcPr>
-            <w:tcW w:type="dxa" w:w="2000"/>
-          </w:tcPr>
-          <w:p>
-            <w:pPr>
-              <w:spacing w:after="40" w:before="40"/>
-              <w:jc w:val="left"/>
-            </w:pPr>
-            <w:r>
-              <w:rPr>
-                <w:b/>
-                <w:bCs/>
-                <w:color w:val="9D7A3A"/>
-                <w:sz w:val="16"/>
-                <w:szCs w:val="16"/>
-              </w:rPr>
-              <w:t xml:space="preserve"/>
-            </w:r>
-          </w:p>
-        </w:tc>
-        <w:tc>
-          <w:tcPr>
-            <w:tcW w:type="dxa" w:w="1800"/>
-          </w:tcPr>
-          <w:p>
-            <w:pPr>
-              <w:spacing w:after="40" w:before="40"/>
-              <w:jc w:val="right"/>
-            </w:pPr>
-            <w:r>
-              <w:rPr>
-                <w:b/>
-                <w:bCs/>
-                <w:color w:val="9D7A3A"/>
-                <w:sz w:val="16"/>
-                <w:szCs w:val="16"/>
-              </w:rPr>
-              <w:t xml:space="preserve"/>
-            </w:r>
-          </w:p>
-        </w:tc>
-      </w:tr>
-      <w:tr>
-        <w:tc>
-          <w:tcPr>
-            <w:tcW w:type="dxa" w:w="9300"/>
-            <w:gridSpan w:val="5"/>
-          </w:tcPr>
-          <w:p>
-            <w:pPr>
-              <w:spacing w:after="40" w:before="0"/>
-              <w:ind w:left="5600"/>
-              <w:jc w:val="left"/>
-            </w:pPr>
-            <w:r>
-              <w:rPr>
-                <w:i w:val="false"/>
-                <w:iCs w:val="false"/>
-                <w:color w:val="1A2744"/>
-                <w:sz w:val="15"/>
-                <w:szCs w:val="15"/>
-              </w:rPr>
-              <w:t xml:space="preserve">↪ SELECT * FROM users WHERE email = ?</w:t>
-            </w:r>
-          </w:p>
-        </w:tc>
-      </w:tr>
-      <w:tr>
-        <w:tc>
-          <w:tcPr>
-            <w:tcW w:type="dxa" w:w="1500"/>
-          </w:tcPr>
-          <w:p/>
-        </w:tc>
-        <w:tc>
-          <w:tcPr>
-            <w:tcW w:type="dxa" w:w="2000"/>
-          </w:tcPr>
-          <w:p/>
-        </w:tc>
-        <w:tc>
-          <w:tcPr>
-            <w:tcW w:type="dxa" w:w="2000"/>
-          </w:tcPr>
-          <w:p/>
-        </w:tc>
-        <w:tc>
-          <w:tcPr>
-            <w:tcW w:type="dxa" w:w="2000"/>
-          </w:tcPr>
-          <w:p>
-            <w:pPr>
-              <w:spacing w:after="40" w:before="40"/>
-              <w:jc w:val="right"/>
-            </w:pPr>
-            <w:r>
-              <w:rPr>
-                <w:b/>
-                <w:bCs/>
-                <w:color w:val="9D7A3A"/>
-                <w:sz w:val="16"/>
-                <w:szCs w:val="16"/>
-              </w:rPr>
-              <w:t xml:space="preserve">←</w:t>
-            </w:r>
-          </w:p>
-        </w:tc>
-        <w:tc>
-          <w:tcPr>
-            <w:tcW w:type="dxa" w:w="1800"/>
-          </w:tcPr>
-          <w:p>
-            <w:pPr>
-              <w:spacing w:after="40" w:before="40"/>
-              <w:jc w:val="left"/>
-            </w:pPr>
-            <w:r>
-              <w:rPr>
-                <w:b/>
-                <w:bCs/>
-                <w:color w:val="9D7A3A"/>
-                <w:sz w:val="16"/>
-                <w:szCs w:val="16"/>
-              </w:rPr>
-              <w:t xml:space="preserve"/>
-            </w:r>
-          </w:p>
-        </w:tc>
-      </w:tr>
-      <w:tr>
-        <w:tc>
-          <w:tcPr>
-            <w:tcW w:type="dxa" w:w="9300"/>
-            <w:gridSpan w:val="5"/>
-          </w:tcPr>
-          <w:p>
-            <w:pPr>
-              <w:spacing w:after="40" w:before="0"/>
-              <w:ind w:left="0"/>
-              <w:jc w:val="right"/>
-            </w:pPr>
-            <w:r>
-              <w:rPr>
-                <w:i/>
-                <w:iCs/>
-                <w:color w:val="777777"/>
-                <w:sz w:val="15"/>
-                <w:szCs w:val="15"/>
-              </w:rPr>
-              <w:t xml:space="preserve">↩ Retourne User (hash bcrypt)</w:t>
-            </w:r>
-          </w:p>
-        </w:tc>
-      </w:tr>
-      <w:tr>
-        <w:tc>
-          <w:tcPr>
-            <w:tcW w:type="dxa" w:w="1500"/>
-          </w:tcPr>
-          <w:p/>
-        </w:tc>
-        <w:tc>
-          <w:tcPr>
-            <w:tcW w:type="dxa" w:w="2000"/>
-          </w:tcPr>
-          <w:p/>
-        </w:tc>
-        <w:tc>
-          <w:tcPr>
-            <w:tcW w:type="dxa" w:w="2000"/>
-          </w:tcPr>
-          <w:p/>
-        </w:tc>
-        <w:tc>
-          <w:tcPr>
-            <w:tcW w:type="dxa" w:w="2000"/>
-          </w:tcPr>
-          <w:p>
-            <w:pPr>
-              <w:spacing w:after="40" w:before="40"/>
-              <w:jc w:val="center"/>
-            </w:pPr>
-            <w:r>
-              <w:rPr>
-                <w:i/>
-                <w:iCs/>
-                <w:color w:val="555555"/>
-                <w:sz w:val="14"/>
-                <w:szCs w:val="14"/>
-              </w:rPr>
-              <w:t xml:space="preserve">↻ bcrypt.compare(password, hash) → ✓</w:t>
-            </w:r>
-          </w:p>
-        </w:tc>
-        <w:tc>
-          <w:tcPr>
-            <w:tcW w:type="dxa" w:w="1800"/>
-          </w:tcPr>
-          <w:p/>
-        </w:tc>
-      </w:tr>
-      <w:tr>
-        <w:tc>
-          <w:tcPr>
-            <w:tcW w:type="dxa" w:w="9300"/>
-            <w:gridSpan w:val="5"/>
-          </w:tcPr>
-          <w:p>
-            <w:pPr>
-              <w:spacing w:after="40" w:before="0"/>
-              <w:ind w:left="5600"/>
-              <w:jc w:val="left"/>
-            </w:pPr>
-            <w:r>
-              <w:rPr>
-                <w:i w:val="false"/>
-                <w:iCs w:val="false"/>
-                <w:color w:val="1A2744"/>
-                <w:sz w:val="15"/>
-                <w:szCs w:val="15"/>
-              </w:rPr>
-              <w:t xml:space="preserve">↪ bcrypt.compare(password, hash) → ✓</w:t>
-            </w:r>
-          </w:p>
-        </w:tc>
-      </w:tr>
-      <w:tr>
-        <w:tc>
-          <w:tcPr>
-            <w:tcW w:type="dxa" w:w="1500"/>
-          </w:tcPr>
-          <w:p/>
-        </w:tc>
-        <w:tc>
-          <w:tcPr>
-            <w:tcW w:type="dxa" w:w="2000"/>
-          </w:tcPr>
-          <w:p/>
-        </w:tc>
-        <w:tc>
-          <w:tcPr>
-            <w:tcW w:type="dxa" w:w="2000"/>
-          </w:tcPr>
-          <w:p>
-            <w:pPr>
-              <w:spacing w:after="40" w:before="40"/>
-              <w:jc w:val="right"/>
-            </w:pPr>
-            <w:r>
-              <w:rPr>
-                <w:b/>
-                <w:bCs/>
-                <w:color w:val="9D7A3A"/>
-                <w:sz w:val="16"/>
-                <w:szCs w:val="16"/>
-              </w:rPr>
-              <w:t xml:space="preserve">←</w:t>
-            </w:r>
-          </w:p>
-        </w:tc>
-        <w:tc>
-          <w:tcPr>
-            <w:tcW w:type="dxa" w:w="2000"/>
-          </w:tcPr>
-          <w:p>
-            <w:pPr>
-              <w:spacing w:after="40" w:before="40"/>
-              <w:jc w:val="left"/>
-            </w:pPr>
-            <w:r>
-              <w:rPr>
-                <w:b/>
-                <w:bCs/>
-                <w:color w:val="9D7A3A"/>
-                <w:sz w:val="16"/>
-                <w:szCs w:val="16"/>
-              </w:rPr>
-              <w:t xml:space="preserve"/>
-            </w:r>
-          </w:p>
-        </w:tc>
-        <w:tc>
-          <w:tcPr>
-            <w:tcW w:type="dxa" w:w="1800"/>
-          </w:tcPr>
-          <w:p/>
-        </w:tc>
-      </w:tr>
-      <w:tr>
-        <w:tc>
-          <w:tcPr>
-            <w:tcW w:type="dxa" w:w="9300"/>
-            <w:gridSpan w:val="5"/>
-          </w:tcPr>
-          <w:p>
-            <w:pPr>
-              <w:spacing w:after="40" w:before="0"/>
-              <w:ind w:left="0"/>
-              <w:jc w:val="right"/>
-            </w:pPr>
-            <w:r>
-              <w:rPr>
-                <w:i/>
-                <w:iCs/>
-                <w:color w:val="777777"/>
-                <w:sz w:val="15"/>
-                <w:szCs w:val="15"/>
-              </w:rPr>
-              <w:t xml:space="preserve">↩ Retourne User validé</w:t>
-            </w:r>
-          </w:p>
-        </w:tc>
-      </w:tr>
-      <w:tr>
-        <w:tc>
-          <w:tcPr>
-            <w:tcW w:type="dxa" w:w="1500"/>
-          </w:tcPr>
-          <w:p/>
-        </w:tc>
-        <w:tc>
-          <w:tcPr>
-            <w:tcW w:type="dxa" w:w="2000"/>
-          </w:tcPr>
-          <w:p/>
-        </w:tc>
-        <w:tc>
-          <w:tcPr>
-            <w:tcW w:type="dxa" w:w="2000"/>
-          </w:tcPr>
-          <w:p>
-            <w:pPr>
-              <w:spacing w:after="40" w:before="40"/>
-              <w:jc w:val="left"/>
-            </w:pPr>
-            <w:r>
-              <w:rPr>
-                <w:b/>
-                <w:bCs/>
-                <w:color w:val="9D7A3A"/>
-                <w:sz w:val="16"/>
-                <w:szCs w:val="16"/>
-              </w:rPr>
-              <w:t xml:space="preserve"/>
-            </w:r>
-          </w:p>
-        </w:tc>
-        <w:tc>
-          <w:tcPr>
-            <w:tcW w:type="dxa" w:w="2000"/>
-          </w:tcPr>
-          <w:p>
-            <w:pPr>
-              <w:spacing w:after="40" w:before="40"/>
-              <w:jc w:val="right"/>
-            </w:pPr>
-            <w:r>
-              <w:rPr>
-                <w:b/>
-                <w:bCs/>
-                <w:color w:val="9D7A3A"/>
-                <w:sz w:val="16"/>
-                <w:szCs w:val="16"/>
-              </w:rPr>
-              <w:t xml:space="preserve"/>
-            </w:r>
-          </w:p>
-        </w:tc>
-        <w:tc>
-          <w:tcPr>
-            <w:tcW w:type="dxa" w:w="1800"/>
-          </w:tcPr>
-          <w:p/>
-        </w:tc>
-      </w:tr>
-      <w:tr>
-        <w:tc>
-          <w:tcPr>
-            <w:tcW w:type="dxa" w:w="9300"/>
-            <w:gridSpan w:val="5"/>
-          </w:tcPr>
-          <w:p>
-            <w:pPr>
-              <w:spacing w:after="40" w:before="0"/>
-              <w:ind w:left="3600"/>
-              <w:jc w:val="left"/>
-            </w:pPr>
-            <w:r>
-              <w:rPr>
-                <w:i w:val="false"/>
-                <w:iCs w:val="false"/>
-                <w:color w:val="1A2744"/>
-                <w:sz w:val="15"/>
-                <w:szCs w:val="15"/>
-              </w:rPr>
-              <w:t xml:space="preserve">↪ jwtService.sign({ id, role, exp:24h })</w:t>
-            </w:r>
-          </w:p>
-        </w:tc>
-      </w:tr>
-      <w:tr>
-        <w:tc>
-          <w:tcPr>
-            <w:tcW w:type="dxa" w:w="1500"/>
-          </w:tcPr>
-          <w:p/>
-        </w:tc>
-        <w:tc>
-          <w:tcPr>
-            <w:tcW w:type="dxa" w:w="2000"/>
-          </w:tcPr>
-          <w:p/>
-        </w:tc>
-        <w:tc>
-          <w:tcPr>
-            <w:tcW w:type="dxa" w:w="2000"/>
-          </w:tcPr>
-          <w:p>
-            <w:pPr>
-              <w:spacing w:after="40" w:before="40"/>
-              <w:jc w:val="right"/>
-            </w:pPr>
-            <w:r>
-              <w:rPr>
-                <w:b/>
-                <w:bCs/>
-                <w:color w:val="9D7A3A"/>
-                <w:sz w:val="16"/>
-                <w:szCs w:val="16"/>
-              </w:rPr>
-              <w:t xml:space="preserve">←</w:t>
-            </w:r>
-          </w:p>
-        </w:tc>
-        <w:tc>
-          <w:tcPr>
-            <w:tcW w:type="dxa" w:w="2000"/>
-          </w:tcPr>
-          <w:p>
-            <w:pPr>
-              <w:spacing w:after="40" w:before="40"/>
-              <w:jc w:val="left"/>
-            </w:pPr>
-            <w:r>
-              <w:rPr>
-                <w:b/>
-                <w:bCs/>
-                <w:color w:val="9D7A3A"/>
-                <w:sz w:val="16"/>
-                <w:szCs w:val="16"/>
-              </w:rPr>
-              <w:t xml:space="preserve"/>
-            </w:r>
-          </w:p>
-        </w:tc>
-        <w:tc>
-          <w:tcPr>
-            <w:tcW w:type="dxa" w:w="1800"/>
-          </w:tcPr>
-          <w:p/>
-        </w:tc>
-      </w:tr>
-      <w:tr>
-        <w:tc>
-          <w:tcPr>
-            <w:tcW w:type="dxa" w:w="9300"/>
-            <w:gridSpan w:val="5"/>
-          </w:tcPr>
-          <w:p>
-            <w:pPr>
-              <w:spacing w:after="40" w:before="0"/>
-              <w:ind w:left="0"/>
-              <w:jc w:val="right"/>
-            </w:pPr>
-            <w:r>
-              <w:rPr>
-                <w:i/>
-                <w:iCs/>
-                <w:color w:val="777777"/>
-                <w:sz w:val="15"/>
-                <w:szCs w:val="15"/>
-              </w:rPr>
-              <w:t xml:space="preserve">↩ access_token: "eyJhbGci..."</w:t>
-            </w:r>
-          </w:p>
-        </w:tc>
-      </w:tr>
-      <w:tr>
-        <w:tc>
-          <w:tcPr>
-            <w:tcW w:type="dxa" w:w="1500"/>
-          </w:tcPr>
-          <w:p/>
-        </w:tc>
-        <w:tc>
-          <w:tcPr>
-            <w:tcW w:type="dxa" w:w="2000"/>
-          </w:tcPr>
-          <w:p>
-            <w:pPr>
-              <w:spacing w:after="40" w:before="40"/>
-              <w:jc w:val="right"/>
-            </w:pPr>
-            <w:r>
-              <w:rPr>
-                <w:b/>
-                <w:bCs/>
-                <w:color w:val="9D7A3A"/>
-                <w:sz w:val="16"/>
-                <w:szCs w:val="16"/>
-              </w:rPr>
-              <w:t xml:space="preserve">←</w:t>
-            </w:r>
-          </w:p>
-        </w:tc>
-        <w:tc>
-          <w:tcPr>
-            <w:tcW w:type="dxa" w:w="2000"/>
-          </w:tcPr>
-          <w:p>
-            <w:pPr>
-              <w:spacing w:after="40" w:before="40"/>
-              <w:jc w:val="left"/>
-            </w:pPr>
-            <w:r>
-              <w:rPr>
-                <w:b/>
-                <w:bCs/>
-                <w:color w:val="9D7A3A"/>
-                <w:sz w:val="16"/>
-                <w:szCs w:val="16"/>
-              </w:rPr>
-              <w:t xml:space="preserve"/>
-            </w:r>
-          </w:p>
-        </w:tc>
-        <w:tc>
-          <w:tcPr>
-            <w:tcW w:type="dxa" w:w="2000"/>
-          </w:tcPr>
-          <w:p/>
-        </w:tc>
-        <w:tc>
-          <w:tcPr>
-            <w:tcW w:type="dxa" w:w="1800"/>
-          </w:tcPr>
-          <w:p/>
-        </w:tc>
-      </w:tr>
-      <w:tr>
-        <w:tc>
-          <w:tcPr>
-            <w:tcW w:type="dxa" w:w="9300"/>
-            <w:gridSpan w:val="5"/>
-          </w:tcPr>
-          <w:p>
-            <w:pPr>
-              <w:spacing w:after="40" w:before="0"/>
-              <w:ind w:left="0"/>
-              <w:jc w:val="right"/>
-            </w:pPr>
-            <w:r>
-              <w:rPr>
-                <w:i/>
-                <w:iCs/>
-                <w:color w:val="777777"/>
-                <w:sz w:val="15"/>
-                <w:szCs w:val="15"/>
-              </w:rPr>
-              <w:t xml:space="preserve">↩ HTTP 200 { access_token }</w:t>
-            </w:r>
-          </w:p>
-        </w:tc>
-      </w:tr>
-      <w:tr>
-        <w:tc>
-          <w:tcPr>
-            <w:tcW w:type="dxa" w:w="1500"/>
-          </w:tcPr>
-          <w:p/>
-        </w:tc>
-        <w:tc>
-          <w:tcPr>
-            <w:tcW w:type="dxa" w:w="2000"/>
-          </w:tcPr>
-          <w:p>
-            <w:pPr>
-              <w:spacing w:after="40" w:before="40"/>
-              <w:jc w:val="center"/>
-            </w:pPr>
-            <w:r>
-              <w:rPr>
-                <w:i/>
-                <w:iCs/>
-                <w:color w:val="555555"/>
-                <w:sz w:val="14"/>
-                <w:szCs w:val="14"/>
-              </w:rPr>
-              <w:t xml:space="preserve">↻ localStorage.setItem("token", ...)</w:t>
-            </w:r>
-          </w:p>
-        </w:tc>
-        <w:tc>
-          <w:tcPr>
-            <w:tcW w:type="dxa" w:w="2000"/>
-          </w:tcPr>
-          <w:p/>
-        </w:tc>
-        <w:tc>
-          <w:tcPr>
-            <w:tcW w:type="dxa" w:w="2000"/>
-          </w:tcPr>
-          <w:p/>
-        </w:tc>
-        <w:tc>
-          <w:tcPr>
-            <w:tcW w:type="dxa" w:w="1800"/>
-          </w:tcPr>
-          <w:p/>
-        </w:tc>
-      </w:tr>
-      <w:tr>
-        <w:tc>
-          <w:tcPr>
-            <w:tcW w:type="dxa" w:w="9300"/>
-            <w:gridSpan w:val="5"/>
-          </w:tcPr>
-          <w:p>
-            <w:pPr>
-              <w:spacing w:after="40" w:before="0"/>
-              <w:ind w:left="1600"/>
-              <w:jc w:val="left"/>
-            </w:pPr>
-            <w:r>
-              <w:rPr>
-                <w:i w:val="false"/>
-                <w:iCs w:val="false"/>
-                <w:color w:val="1A2744"/>
-                <w:sz w:val="15"/>
-                <w:szCs w:val="15"/>
-              </w:rPr>
-              <w:t xml:space="preserve">↪ localStorage.setItem("token", ...)</w:t>
-            </w:r>
-          </w:p>
-        </w:tc>
-      </w:tr>
-      <w:tr>
-        <w:tc>
-          <w:tcPr>
-            <w:tcW w:type="dxa" w:w="1500"/>
-          </w:tcPr>
-          <w:p>
-            <w:pPr>
-              <w:spacing w:after="40" w:before="40"/>
-              <w:jc w:val="right"/>
-            </w:pPr>
-            <w:r>
-              <w:rPr>
-                <w:b/>
-                <w:bCs/>
-                <w:color w:val="9D7A3A"/>
-                <w:sz w:val="16"/>
-                <w:szCs w:val="16"/>
-              </w:rPr>
-              <w:t xml:space="preserve">←</w:t>
-            </w:r>
-          </w:p>
-        </w:tc>
-        <w:tc>
-          <w:tcPr>
-            <w:tcW w:type="dxa" w:w="2000"/>
-          </w:tcPr>
-          <w:p>
-            <w:pPr>
-              <w:spacing w:after="40" w:before="40"/>
-              <w:jc w:val="left"/>
-            </w:pPr>
-            <w:r>
-              <w:rPr>
-                <w:b/>
-                <w:bCs/>
-                <w:color w:val="9D7A3A"/>
-                <w:sz w:val="16"/>
-                <w:szCs w:val="16"/>
-              </w:rPr>
-              <w:t xml:space="preserve"/>
-            </w:r>
-          </w:p>
-        </w:tc>
-        <w:tc>
-          <w:tcPr>
-            <w:tcW w:type="dxa" w:w="2000"/>
-          </w:tcPr>
-          <w:p/>
-        </w:tc>
-        <w:tc>
-          <w:tcPr>
-            <w:tcW w:type="dxa" w:w="2000"/>
-          </w:tcPr>
-          <w:p/>
-        </w:tc>
-        <w:tc>
-          <w:tcPr>
-            <w:tcW w:type="dxa" w:w="1800"/>
-          </w:tcPr>
-          <w:p/>
-        </w:tc>
-      </w:tr>
-      <w:tr>
-        <w:tc>
-          <w:tcPr>
-            <w:tcW w:type="dxa" w:w="9300"/>
-            <w:gridSpan w:val="5"/>
-          </w:tcPr>
-          <w:p>
-            <w:pPr>
-              <w:spacing w:after="40" w:before="0"/>
-              <w:ind w:left="0"/>
-              <w:jc w:val="right"/>
-            </w:pPr>
-            <w:r>
-              <w:rPr>
-                <w:i/>
-                <w:iCs/>
-                <w:color w:val="777777"/>
-                <w:sz w:val="15"/>
-                <w:szCs w:val="15"/>
-              </w:rPr>
-              <w:t xml:space="preserve">↩ Redirection vers /dashboard</w:t>
-            </w:r>
-          </w:p>
-        </w:tc>
-      </w:tr>
-    </w:tbl>
-    <w:p>
-      <w:pPr>
-        <w:spacing w:after="120"/>
-      </w:pPr>
     </w:p>
     <w:p>
       <w:pPr>

</xml_diff>